<commit_message>
Updated Device Library instructions to avoid an anemic software package
</commit_message>
<xml_diff>
--- a/Design/Device Library Level 1 - Conversations/2026-09-03 Design Conversations.docx
+++ b/Design/Device Library Level 1 - Conversations/2026-09-03 Design Conversations.docx
@@ -902,10 +902,10 @@
           <w14:ligatures w14:val="none"/>
         </w:rPr>
         <w:drawing>
-          <wp:inline distT="0" distB="0" distL="0" distR="0" wp14:anchorId="5BA9E21B" wp14:editId="121908E5">
+          <wp:inline distT="0" distB="0" distL="0" distR="0" wp14:anchorId="7FAA3B33" wp14:editId="0F995F24">
             <wp:extent cx="1066800" cy="1066800"/>
             <wp:effectExtent l="0" t="0" r="0" b="0"/>
-            <wp:docPr id="1897468176" name="Picture 2"/>
+            <wp:docPr id="1956221265" name="Picture 4"/>
             <wp:cNvGraphicFramePr>
               <a:graphicFrameLocks xmlns:a="http://schemas.openxmlformats.org/drawingml/2006/main" noChangeAspect="1"/>
             </wp:cNvGraphicFramePr>
@@ -913,7 +913,7 @@
               <a:graphicData uri="http://schemas.openxmlformats.org/drawingml/2006/picture">
                 <pic:pic xmlns:pic="http://schemas.openxmlformats.org/drawingml/2006/picture">
                   <pic:nvPicPr>
-                    <pic:cNvPr id="0" name="Picture 1"/>
+                    <pic:cNvPr id="0" name="Picture 5"/>
                     <pic:cNvPicPr>
                       <a:picLocks noChangeAspect="1" noChangeArrowheads="1"/>
                     </pic:cNvPicPr>
@@ -1437,10 +1437,10 @@
           <w14:ligatures w14:val="none"/>
         </w:rPr>
         <w:drawing>
-          <wp:inline distT="0" distB="0" distL="0" distR="0" wp14:anchorId="1F540E56" wp14:editId="3C2BA162">
+          <wp:inline distT="0" distB="0" distL="0" distR="0" wp14:anchorId="40ADFE00" wp14:editId="33D95B24">
             <wp:extent cx="1066800" cy="1066800"/>
             <wp:effectExtent l="0" t="0" r="0" b="0"/>
-            <wp:docPr id="1760297867" name="Picture 1"/>
+            <wp:docPr id="320995412" name="Picture 3"/>
             <wp:cNvGraphicFramePr>
               <a:graphicFrameLocks xmlns:a="http://schemas.openxmlformats.org/drawingml/2006/main" noChangeAspect="1"/>
             </wp:cNvGraphicFramePr>
@@ -1448,7 +1448,7 @@
               <a:graphicData uri="http://schemas.openxmlformats.org/drawingml/2006/picture">
                 <pic:pic xmlns:pic="http://schemas.openxmlformats.org/drawingml/2006/picture">
                   <pic:nvPicPr>
-                    <pic:cNvPr id="0" name="Picture 2"/>
+                    <pic:cNvPr id="0" name="Picture 6"/>
                     <pic:cNvPicPr>
                       <a:picLocks noChangeAspect="1" noChangeArrowheads="1"/>
                     </pic:cNvPicPr>
@@ -1809,6 +1809,935 @@
           <w14:ligatures w14:val="none"/>
         </w:rPr>
         <w:t xml:space="preserve"> when you’re ready for live ChatGPT runs to use this latest wording.</w:t>
+      </w:r>
+    </w:p>
+    <w:p>
+      <w:pPr>
+        <w:spacing w:before="100" w:beforeAutospacing="1" w:after="100" w:afterAutospacing="1" w:line="240" w:lineRule="auto"/>
+        <w:outlineLvl w:val="4"/>
+        <w:rPr>
+          <w:rFonts w:ascii="Times New Roman" w:eastAsia="Times New Roman" w:hAnsi="Times New Roman" w:cs="Times New Roman"/>
+          <w:b/>
+          <w:bCs/>
+          <w:kern w:val="0"/>
+          <w:sz w:val="20"/>
+          <w:szCs w:val="20"/>
+          <w14:ligatures w14:val="none"/>
+        </w:rPr>
+      </w:pPr>
+      <w:r>
+        <w:rPr>
+          <w:rFonts w:ascii="Times New Roman" w:eastAsia="Times New Roman" w:hAnsi="Times New Roman" w:cs="Times New Roman"/>
+          <w:b/>
+          <w:bCs/>
+          <w:kern w:val="0"/>
+          <w:sz w:val="20"/>
+          <w:szCs w:val="20"/>
+          <w14:ligatures w14:val="none"/>
+        </w:rPr>
+        <w:t>You said:</w:t>
+      </w:r>
+    </w:p>
+    <w:p>
+      <w:pPr>
+        <w:spacing w:after="0" w:line="240" w:lineRule="auto"/>
+        <w:rPr>
+          <w:rFonts w:ascii="Times New Roman" w:eastAsia="Times New Roman" w:hAnsi="Times New Roman" w:cs="Times New Roman"/>
+          <w:kern w:val="0"/>
+          <w14:ligatures w14:val="none"/>
+        </w:rPr>
+      </w:pPr>
+      <w:r>
+        <w:rPr>
+          <w:rFonts w:ascii="Times New Roman" w:eastAsia="Times New Roman" w:hAnsi="Times New Roman" w:cs="Times New Roman"/>
+          <w:kern w:val="0"/>
+          <w14:ligatures w14:val="none"/>
+        </w:rPr>
+        <w:t xml:space="preserve">Ok, I tried out the agent, but yikes - what it produced looked nothing like what would be provided by a vendor. It was anemic. Here is a conversation I had with the agent after it finished: › This is nowhere near sufficient. A vendor would never ship such a barebones package and documentation. We need a full-blown Python wrapper and high- quality documentation. Why didn't you make that? Suggest a block paragraph of edits I can make to the agent instructions for next time. • I under-scoped the work. I treated “Level 1” and the upstream minimal target as the package boundary, instead of treating them as the starting proof within the instruction’s explicit requirement for a polished, vendor-quality wrapper with the broader documented configuration, acquisition, trigger, measurement, waveform, diagnostics, examples, tests, and documentation surface. The waveform framing issue justified an honest limitation for scaled waveform parsing, but it did not justify stopping the rest of the documented API. The result should have been a substantially fuller library, with that one capability clearly isolated as unresolved. Add this paragraph to the next agent instructions: &gt; “For Device Library stages, do not interpret ‘Level 1,’ ‘minimal target,’ &gt; hello-world handoffs, or an unresolved issue in one device capability as &gt; permission to deliver a minimal wrapper. Unless the user explicitly limits &gt; scope, implement a vendor-quality, broadly useful wrapper covering every &gt; routine documented command family relevant to the selected interface and &gt; upstream science goals: connection/session handling, identity and &gt; diagnostics, channel configuration, timebase, acquisition, trigger &gt; configuration, run/stop, waveform setup and retrieval, measurements, and &gt; status. Isolate unsupported or </w:t>
+      </w:r>
+      <w:r>
+        <w:rPr>
+          <w:rFonts w:ascii="Times New Roman" w:eastAsia="Times New Roman" w:hAnsi="Times New Roman" w:cs="Times New Roman"/>
+          <w:kern w:val="0"/>
+          <w14:ligatures w14:val="none"/>
+        </w:rPr>
+        <w:lastRenderedPageBreak/>
+        <w:t xml:space="preserve">empirically blocked features behind clear &gt; exceptions and documentation, but continue implementing and testing the &gt; remaining documented API. Deliver complete scientist-facing documentation, &gt; API reference, troubleshooting, practical examples, mocked transport tests, &gt; command-construction/validation tests, and a coherent distributable package; &gt; do not call the stage complete or materially adequate merely because a &gt; narrow proof path works.” </w:t>
+      </w:r>
+    </w:p>
+    <w:p>
+      <w:pPr>
+        <w:spacing w:before="100" w:beforeAutospacing="1" w:after="100" w:afterAutospacing="1" w:line="240" w:lineRule="auto"/>
+        <w:outlineLvl w:val="5"/>
+        <w:rPr>
+          <w:rFonts w:ascii="Times New Roman" w:eastAsia="Times New Roman" w:hAnsi="Times New Roman" w:cs="Times New Roman"/>
+          <w:b/>
+          <w:bCs/>
+          <w:kern w:val="0"/>
+          <w:sz w:val="15"/>
+          <w:szCs w:val="15"/>
+          <w14:ligatures w14:val="none"/>
+        </w:rPr>
+      </w:pPr>
+      <w:r>
+        <w:rPr>
+          <w:rFonts w:ascii="Times New Roman" w:eastAsia="Times New Roman" w:hAnsi="Times New Roman" w:cs="Times New Roman"/>
+          <w:b/>
+          <w:bCs/>
+          <w:kern w:val="0"/>
+          <w:sz w:val="15"/>
+          <w:szCs w:val="15"/>
+          <w14:ligatures w14:val="none"/>
+        </w:rPr>
+        <w:t>The assistant said:</w:t>
+      </w:r>
+    </w:p>
+    <w:p>
+      <w:pPr>
+        <w:spacing w:after="0" w:line="240" w:lineRule="auto"/>
+        <w:rPr>
+          <w:rFonts w:ascii="Times New Roman" w:eastAsia="Times New Roman" w:hAnsi="Times New Roman" w:cs="Times New Roman"/>
+          <w:kern w:val="0"/>
+          <w14:ligatures w14:val="none"/>
+        </w:rPr>
+      </w:pPr>
+      <w:r>
+        <w:rPr>
+          <w:rFonts w:ascii="Times New Roman" w:eastAsia="Times New Roman" w:hAnsi="Times New Roman" w:cs="Times New Roman"/>
+          <w:kern w:val="0"/>
+          <w14:ligatures w14:val="none"/>
+        </w:rPr>
+        <w:t>Thought for 5s</w:t>
+      </w:r>
+    </w:p>
+    <w:p>
+      <w:pPr>
+        <w:spacing w:before="100" w:beforeAutospacing="1" w:after="100" w:afterAutospacing="1" w:line="240" w:lineRule="auto"/>
+        <w:rPr>
+          <w:rFonts w:ascii="Times New Roman" w:eastAsia="Times New Roman" w:hAnsi="Times New Roman" w:cs="Times New Roman"/>
+          <w:kern w:val="0"/>
+          <w14:ligatures w14:val="none"/>
+        </w:rPr>
+      </w:pPr>
+      <w:r>
+        <w:rPr>
+          <w:rFonts w:ascii="Times New Roman" w:eastAsia="Times New Roman" w:hAnsi="Times New Roman" w:cs="Times New Roman"/>
+          <w:kern w:val="0"/>
+          <w14:ligatures w14:val="none"/>
+        </w:rPr>
+        <w:t xml:space="preserve">I’m adding that corrective scope rule directly into the agent’s instructions so </w:t>
+      </w:r>
+      <w:r>
+        <w:rPr>
+          <w:rFonts w:ascii="Times New Roman" w:eastAsia="Times New Roman" w:hAnsi="Times New Roman" w:cs="Times New Roman"/>
+          <w:b/>
+          <w:bCs/>
+          <w:kern w:val="0"/>
+          <w14:ligatures w14:val="none"/>
+        </w:rPr>
+        <w:t>Level 1 can’t be treated as a barebones wrapper target</w:t>
+      </w:r>
+      <w:r>
+        <w:rPr>
+          <w:rFonts w:ascii="Times New Roman" w:eastAsia="Times New Roman" w:hAnsi="Times New Roman" w:cs="Times New Roman"/>
+          <w:kern w:val="0"/>
+          <w14:ligatures w14:val="none"/>
+        </w:rPr>
+        <w:t xml:space="preserve"> next time.</w:t>
+      </w:r>
+    </w:p>
+    <w:p>
+      <w:pPr>
+        <w:spacing w:after="0" w:line="240" w:lineRule="auto"/>
+        <w:rPr>
+          <w:rFonts w:ascii="Times New Roman" w:eastAsia="Times New Roman" w:hAnsi="Times New Roman" w:cs="Times New Roman"/>
+          <w:kern w:val="0"/>
+          <w14:ligatures w14:val="none"/>
+        </w:rPr>
+      </w:pPr>
+      <w:r>
+        <w:rPr>
+          <w:rFonts w:ascii="Times New Roman" w:eastAsia="Times New Roman" w:hAnsi="Times New Roman" w:cs="Times New Roman"/>
+          <w:kern w:val="0"/>
+          <w14:ligatures w14:val="none"/>
+        </w:rPr>
+        <w:t>Updated instructions</w:t>
+      </w:r>
+    </w:p>
+    <w:p>
+      <w:pPr>
+        <w:spacing w:before="100" w:beforeAutospacing="1" w:after="100" w:afterAutospacing="1" w:line="240" w:lineRule="auto"/>
+        <w:rPr>
+          <w:rFonts w:ascii="Times New Roman" w:eastAsia="Times New Roman" w:hAnsi="Times New Roman" w:cs="Times New Roman"/>
+          <w:kern w:val="0"/>
+          <w14:ligatures w14:val="none"/>
+        </w:rPr>
+      </w:pPr>
+      <w:r>
+        <w:rPr>
+          <w:rFonts w:ascii="Times New Roman" w:eastAsia="Times New Roman" w:hAnsi="Times New Roman" w:cs="Times New Roman"/>
+          <w:kern w:val="0"/>
+          <w14:ligatures w14:val="none"/>
+        </w:rPr>
+        <w:t>One small follow-up patch is needed in the existing-work section so prior MVP packages are explicitly treated as scaffolding, not the final scope.</w:t>
+      </w:r>
+    </w:p>
+    <w:p>
+      <w:pPr>
+        <w:spacing w:after="0" w:line="240" w:lineRule="auto"/>
+        <w:rPr>
+          <w:rFonts w:ascii="Times New Roman" w:eastAsia="Times New Roman" w:hAnsi="Times New Roman" w:cs="Times New Roman"/>
+          <w:kern w:val="0"/>
+          <w14:ligatures w14:val="none"/>
+        </w:rPr>
+      </w:pPr>
+      <w:r>
+        <w:rPr>
+          <w:rFonts w:ascii="Times New Roman" w:eastAsia="Times New Roman" w:hAnsi="Times New Roman" w:cs="Times New Roman"/>
+          <w:kern w:val="0"/>
+          <w14:ligatures w14:val="none"/>
+        </w:rPr>
+        <w:t>Updated instructions</w:t>
+      </w:r>
+    </w:p>
+    <w:p>
+      <w:pPr>
+        <w:spacing w:before="100" w:beforeAutospacing="1" w:after="100" w:afterAutospacing="1" w:line="240" w:lineRule="auto"/>
+        <w:rPr>
+          <w:rFonts w:ascii="Times New Roman" w:eastAsia="Times New Roman" w:hAnsi="Times New Roman" w:cs="Times New Roman"/>
+          <w:kern w:val="0"/>
+          <w14:ligatures w14:val="none"/>
+        </w:rPr>
+      </w:pPr>
+      <w:r>
+        <w:rPr>
+          <w:rFonts w:ascii="Times New Roman" w:eastAsia="Times New Roman" w:hAnsi="Times New Roman" w:cs="Times New Roman"/>
+          <w:kern w:val="0"/>
+          <w14:ligatures w14:val="none"/>
+        </w:rPr>
+        <w:t xml:space="preserve">The scope correction is now in the draft. Since this agent has a live version, you’ll need to </w:t>
+      </w:r>
+      <w:r>
+        <w:rPr>
+          <w:rFonts w:ascii="Times New Roman" w:eastAsia="Times New Roman" w:hAnsi="Times New Roman" w:cs="Times New Roman"/>
+          <w:b/>
+          <w:bCs/>
+          <w:kern w:val="0"/>
+          <w14:ligatures w14:val="none"/>
+        </w:rPr>
+        <w:t>Update</w:t>
+      </w:r>
+      <w:r>
+        <w:rPr>
+          <w:rFonts w:ascii="Times New Roman" w:eastAsia="Times New Roman" w:hAnsi="Times New Roman" w:cs="Times New Roman"/>
+          <w:kern w:val="0"/>
+          <w14:ligatures w14:val="none"/>
+        </w:rPr>
+        <w:t xml:space="preserve"> it before normal ChatGPT runs use the fuller vendor-quality-package behavior.</w:t>
+      </w:r>
+    </w:p>
+    <w:p>
+      <w:pPr>
+        <w:spacing w:after="0" w:line="240" w:lineRule="auto"/>
+        <w:rPr>
+          <w:rFonts w:ascii="Times New Roman" w:eastAsia="Times New Roman" w:hAnsi="Times New Roman" w:cs="Times New Roman"/>
+          <w:kern w:val="0"/>
+          <w14:ligatures w14:val="none"/>
+        </w:rPr>
+      </w:pPr>
+      <w:r>
+        <w:rPr>
+          <w:rFonts w:ascii="Times New Roman" w:eastAsia="Times New Roman" w:hAnsi="Times New Roman" w:cs="Times New Roman"/>
+          <w:kern w:val="0"/>
+          <w14:ligatures w14:val="none"/>
+        </w:rPr>
+        <w:t>Summary of changes</w:t>
+      </w:r>
+    </w:p>
+    <w:p>
+      <w:pPr>
+        <w:spacing w:before="100" w:beforeAutospacing="1" w:after="100" w:afterAutospacing="1" w:line="240" w:lineRule="auto"/>
+        <w:rPr>
+          <w:rFonts w:ascii="Times New Roman" w:eastAsia="Times New Roman" w:hAnsi="Times New Roman" w:cs="Times New Roman"/>
+          <w:kern w:val="0"/>
+          <w14:ligatures w14:val="none"/>
+        </w:rPr>
+      </w:pPr>
+      <w:r>
+        <w:rPr>
+          <w:rFonts w:ascii="Times New Roman" w:eastAsia="Times New Roman" w:hAnsi="Times New Roman" w:cs="Times New Roman"/>
+          <w:kern w:val="0"/>
+          <w14:ligatures w14:val="none"/>
+        </w:rPr>
+        <w:t>Added a scope rule that Level 1, minimal targets, hello-world handoffs, MVP handoffs, or one unresolved capability must not be treated as permission to deliver an anemic wrapper.</w:t>
+      </w:r>
+    </w:p>
+    <w:p>
+      <w:pPr>
+        <w:spacing w:before="100" w:beforeAutospacing="1" w:after="100" w:afterAutospacing="1" w:line="240" w:lineRule="auto"/>
+        <w:rPr>
+          <w:rFonts w:ascii="Times New Roman" w:eastAsia="Times New Roman" w:hAnsi="Times New Roman" w:cs="Times New Roman"/>
+          <w:kern w:val="0"/>
+          <w14:ligatures w14:val="none"/>
+        </w:rPr>
+      </w:pPr>
+      <w:r>
+        <w:rPr>
+          <w:rFonts w:ascii="Times New Roman" w:eastAsia="Times New Roman" w:hAnsi="Times New Roman" w:cs="Times New Roman"/>
+          <w:kern w:val="0"/>
+          <w14:ligatures w14:val="none"/>
+        </w:rPr>
+        <w:t>Reframed the implementation target as a full vendor-quality package with a substantially complete routine API surface for the selected interface and upstream science goals.</w:t>
+      </w:r>
+    </w:p>
+    <w:p>
+      <w:pPr>
+        <w:spacing w:before="100" w:beforeAutospacing="1" w:after="100" w:afterAutospacing="1" w:line="240" w:lineRule="auto"/>
+        <w:rPr>
+          <w:rFonts w:ascii="Times New Roman" w:eastAsia="Times New Roman" w:hAnsi="Times New Roman" w:cs="Times New Roman"/>
+          <w:kern w:val="0"/>
+          <w14:ligatures w14:val="none"/>
+        </w:rPr>
+      </w:pPr>
+      <w:r>
+        <w:rPr>
+          <w:rFonts w:ascii="Times New Roman" w:eastAsia="Times New Roman" w:hAnsi="Times New Roman" w:cs="Times New Roman"/>
+          <w:kern w:val="0"/>
+          <w14:ligatures w14:val="none"/>
+        </w:rPr>
+        <w:t>Added explicit coverage expectations for connection/session handling, identity, diagnostics, status, configuration, timing, acquisition, triggers, run/stop, waveform/data retrieval, measurements, metadata, and error/status reporting where documented.</w:t>
+      </w:r>
+    </w:p>
+    <w:p>
+      <w:pPr>
+        <w:spacing w:before="100" w:beforeAutospacing="1" w:after="100" w:afterAutospacing="1" w:line="240" w:lineRule="auto"/>
+        <w:rPr>
+          <w:rFonts w:ascii="Times New Roman" w:eastAsia="Times New Roman" w:hAnsi="Times New Roman" w:cs="Times New Roman"/>
+          <w:kern w:val="0"/>
+          <w14:ligatures w14:val="none"/>
+        </w:rPr>
+      </w:pPr>
+      <w:r>
+        <w:rPr>
+          <w:rFonts w:ascii="Times New Roman" w:eastAsia="Times New Roman" w:hAnsi="Times New Roman" w:cs="Times New Roman"/>
+          <w:kern w:val="0"/>
+          <w14:ligatures w14:val="none"/>
+        </w:rPr>
+        <w:t>Clarified that unsupported or empirically blocked features should be isolated behind clear exceptions and documentation while the rest of the documented API is still implemented and tested.</w:t>
+      </w:r>
+    </w:p>
+    <w:p>
+      <w:pPr>
+        <w:spacing w:before="100" w:beforeAutospacing="1" w:after="100" w:afterAutospacing="1" w:line="240" w:lineRule="auto"/>
+        <w:rPr>
+          <w:rFonts w:ascii="Times New Roman" w:eastAsia="Times New Roman" w:hAnsi="Times New Roman" w:cs="Times New Roman"/>
+          <w:kern w:val="0"/>
+          <w14:ligatures w14:val="none"/>
+        </w:rPr>
+      </w:pPr>
+      <w:r>
+        <w:rPr>
+          <w:rFonts w:ascii="Times New Roman" w:eastAsia="Times New Roman" w:hAnsi="Times New Roman" w:cs="Times New Roman"/>
+          <w:kern w:val="0"/>
+          <w14:ligatures w14:val="none"/>
+        </w:rPr>
+        <w:t>Updated existing-work guidance so prior MVP packages are treated as scaffolding to expand beyond, not the final scope.</w:t>
+      </w:r>
+    </w:p>
+    <w:p>
+      <w:pPr>
+        <w:spacing w:before="100" w:beforeAutospacing="1" w:after="100" w:afterAutospacing="1" w:line="240" w:lineRule="auto"/>
+        <w:rPr>
+          <w:rFonts w:ascii="Times New Roman" w:eastAsia="Times New Roman" w:hAnsi="Times New Roman" w:cs="Times New Roman"/>
+          <w:kern w:val="0"/>
+          <w14:ligatures w14:val="none"/>
+        </w:rPr>
+      </w:pPr>
+      <w:r>
+        <w:rPr>
+          <w:rFonts w:ascii="Times New Roman" w:eastAsia="Times New Roman" w:hAnsi="Times New Roman" w:cs="Times New Roman"/>
+          <w:kern w:val="0"/>
+          <w14:ligatures w14:val="none"/>
+        </w:rPr>
+        <w:t>This should address the “anemic package” failure mode directly.</w:t>
+      </w:r>
+    </w:p>
+    <w:p>
+      <w:pPr>
+        <w:spacing w:before="100" w:beforeAutospacing="1" w:after="100" w:afterAutospacing="1" w:line="240" w:lineRule="auto"/>
+        <w:rPr>
+          <w:rFonts w:ascii="Times New Roman" w:eastAsia="Times New Roman" w:hAnsi="Times New Roman" w:cs="Times New Roman"/>
+          <w:kern w:val="0"/>
+          <w14:ligatures w14:val="none"/>
+        </w:rPr>
+      </w:pPr>
+      <w:r>
+        <w:rPr>
+          <w:rFonts w:ascii="Times New Roman" w:eastAsia="Times New Roman" w:hAnsi="Times New Roman" w:cs="Times New Roman"/>
+          <w:kern w:val="0"/>
+          <w14:ligatures w14:val="none"/>
+        </w:rPr>
+        <w:t xml:space="preserve">Click </w:t>
+      </w:r>
+      <w:r>
+        <w:rPr>
+          <w:rFonts w:ascii="Times New Roman" w:eastAsia="Times New Roman" w:hAnsi="Times New Roman" w:cs="Times New Roman"/>
+          <w:b/>
+          <w:bCs/>
+          <w:kern w:val="0"/>
+          <w14:ligatures w14:val="none"/>
+        </w:rPr>
+        <w:t>Update</w:t>
+      </w:r>
+      <w:r>
+        <w:rPr>
+          <w:rFonts w:ascii="Times New Roman" w:eastAsia="Times New Roman" w:hAnsi="Times New Roman" w:cs="Times New Roman"/>
+          <w:kern w:val="0"/>
+          <w14:ligatures w14:val="none"/>
+        </w:rPr>
+        <w:t xml:space="preserve"> in the editor so the live agent uses these revised instructions.</w:t>
+      </w:r>
+    </w:p>
+    <w:p>
+      <w:pPr>
+        <w:spacing w:before="100" w:beforeAutospacing="1" w:after="100" w:afterAutospacing="1" w:line="240" w:lineRule="auto"/>
+        <w:outlineLvl w:val="4"/>
+        <w:rPr>
+          <w:rFonts w:ascii="Times New Roman" w:eastAsia="Times New Roman" w:hAnsi="Times New Roman" w:cs="Times New Roman"/>
+          <w:b/>
+          <w:bCs/>
+          <w:kern w:val="0"/>
+          <w:sz w:val="20"/>
+          <w:szCs w:val="20"/>
+          <w14:ligatures w14:val="none"/>
+        </w:rPr>
+      </w:pPr>
+      <w:r>
+        <w:rPr>
+          <w:rFonts w:ascii="Times New Roman" w:eastAsia="Times New Roman" w:hAnsi="Times New Roman" w:cs="Times New Roman"/>
+          <w:b/>
+          <w:bCs/>
+          <w:kern w:val="0"/>
+          <w:sz w:val="20"/>
+          <w:szCs w:val="20"/>
+          <w14:ligatures w14:val="none"/>
+        </w:rPr>
+        <w:t>You said:</w:t>
+      </w:r>
+    </w:p>
+    <w:p>
+      <w:pPr>
+        <w:spacing w:after="0" w:line="240" w:lineRule="auto"/>
+        <w:rPr>
+          <w:rFonts w:ascii="Times New Roman" w:eastAsia="Times New Roman" w:hAnsi="Times New Roman" w:cs="Times New Roman"/>
+          <w:kern w:val="0"/>
+          <w14:ligatures w14:val="none"/>
+        </w:rPr>
+      </w:pPr>
+      <w:r>
+        <w:rPr>
+          <w:rFonts w:ascii="Times New Roman" w:eastAsia="Times New Roman" w:hAnsi="Times New Roman" w:cs="Times New Roman"/>
+          <w:kern w:val="0"/>
+          <w14:ligatures w14:val="none"/>
+        </w:rPr>
+        <w:lastRenderedPageBreak/>
+        <w:t>"Level 1" refers to the fact that we are at the Device level, rather than the distributed Control System level (Level 2). Just FYI</w:t>
+      </w:r>
+    </w:p>
+    <w:p>
+      <w:pPr>
+        <w:spacing w:before="100" w:beforeAutospacing="1" w:after="100" w:afterAutospacing="1" w:line="240" w:lineRule="auto"/>
+        <w:outlineLvl w:val="5"/>
+        <w:rPr>
+          <w:rFonts w:ascii="Times New Roman" w:eastAsia="Times New Roman" w:hAnsi="Times New Roman" w:cs="Times New Roman"/>
+          <w:b/>
+          <w:bCs/>
+          <w:kern w:val="0"/>
+          <w:sz w:val="15"/>
+          <w:szCs w:val="15"/>
+          <w14:ligatures w14:val="none"/>
+        </w:rPr>
+      </w:pPr>
+      <w:r>
+        <w:rPr>
+          <w:rFonts w:ascii="Times New Roman" w:eastAsia="Times New Roman" w:hAnsi="Times New Roman" w:cs="Times New Roman"/>
+          <w:b/>
+          <w:bCs/>
+          <w:kern w:val="0"/>
+          <w:sz w:val="15"/>
+          <w:szCs w:val="15"/>
+          <w14:ligatures w14:val="none"/>
+        </w:rPr>
+        <w:t>The assistant said:</w:t>
+      </w:r>
+    </w:p>
+    <w:p>
+      <w:pPr>
+        <w:spacing w:after="0" w:line="240" w:lineRule="auto"/>
+        <w:rPr>
+          <w:rFonts w:ascii="Times New Roman" w:eastAsia="Times New Roman" w:hAnsi="Times New Roman" w:cs="Times New Roman"/>
+          <w:kern w:val="0"/>
+          <w14:ligatures w14:val="none"/>
+        </w:rPr>
+      </w:pPr>
+      <w:r>
+        <w:rPr>
+          <w:rFonts w:ascii="Times New Roman" w:eastAsia="Times New Roman" w:hAnsi="Times New Roman" w:cs="Times New Roman"/>
+          <w:kern w:val="0"/>
+          <w14:ligatures w14:val="none"/>
+        </w:rPr>
+        <w:t>Thought for 3s</w:t>
+      </w:r>
+    </w:p>
+    <w:p>
+      <w:pPr>
+        <w:spacing w:before="100" w:beforeAutospacing="1" w:after="100" w:afterAutospacing="1" w:line="240" w:lineRule="auto"/>
+        <w:rPr>
+          <w:rFonts w:ascii="Times New Roman" w:eastAsia="Times New Roman" w:hAnsi="Times New Roman" w:cs="Times New Roman"/>
+          <w:kern w:val="0"/>
+          <w14:ligatures w14:val="none"/>
+        </w:rPr>
+      </w:pPr>
+      <w:r>
+        <w:rPr>
+          <w:rFonts w:ascii="Times New Roman" w:eastAsia="Times New Roman" w:hAnsi="Times New Roman" w:cs="Times New Roman"/>
+          <w:kern w:val="0"/>
+          <w14:ligatures w14:val="none"/>
+        </w:rPr>
+        <w:t xml:space="preserve">I’ll clarify that </w:t>
+      </w:r>
+      <w:r>
+        <w:rPr>
+          <w:rFonts w:ascii="Times New Roman" w:eastAsia="Times New Roman" w:hAnsi="Times New Roman" w:cs="Times New Roman"/>
+          <w:b/>
+          <w:bCs/>
+          <w:kern w:val="0"/>
+          <w14:ligatures w14:val="none"/>
+        </w:rPr>
+        <w:t>Level 1 means device-level scope</w:t>
+      </w:r>
+      <w:r>
+        <w:rPr>
+          <w:rFonts w:ascii="Times New Roman" w:eastAsia="Times New Roman" w:hAnsi="Times New Roman" w:cs="Times New Roman"/>
+          <w:kern w:val="0"/>
+          <w14:ligatures w14:val="none"/>
+        </w:rPr>
+        <w:t>, not minimal implementation scope, so the agent doesn’t underbuild because of that label.</w:t>
+      </w:r>
+    </w:p>
+    <w:p>
+      <w:pPr>
+        <w:spacing w:after="0" w:line="240" w:lineRule="auto"/>
+        <w:rPr>
+          <w:rFonts w:ascii="Times New Roman" w:eastAsia="Times New Roman" w:hAnsi="Times New Roman" w:cs="Times New Roman"/>
+          <w:kern w:val="0"/>
+          <w14:ligatures w14:val="none"/>
+        </w:rPr>
+      </w:pPr>
+      <w:r>
+        <w:rPr>
+          <w:rFonts w:ascii="Times New Roman" w:eastAsia="Times New Roman" w:hAnsi="Times New Roman" w:cs="Times New Roman"/>
+          <w:kern w:val="0"/>
+          <w14:ligatures w14:val="none"/>
+        </w:rPr>
+        <w:t>Updated instructions</w:t>
+      </w:r>
+    </w:p>
+    <w:p>
+      <w:pPr>
+        <w:spacing w:after="0" w:line="240" w:lineRule="auto"/>
+        <w:rPr>
+          <w:rFonts w:ascii="Times New Roman" w:eastAsia="Times New Roman" w:hAnsi="Times New Roman" w:cs="Times New Roman"/>
+          <w:kern w:val="0"/>
+          <w14:ligatures w14:val="none"/>
+        </w:rPr>
+      </w:pPr>
+      <w:r>
+        <w:rPr>
+          <w:rFonts w:ascii="Times New Roman" w:eastAsia="Times New Roman" w:hAnsi="Times New Roman" w:cs="Times New Roman"/>
+          <w:kern w:val="0"/>
+          <w14:ligatures w14:val="none"/>
+        </w:rPr>
+        <w:t>Summary of changes</w:t>
+      </w:r>
+    </w:p>
+    <w:p>
+      <w:pPr>
+        <w:spacing w:before="100" w:beforeAutospacing="1" w:after="100" w:afterAutospacing="1" w:line="240" w:lineRule="auto"/>
+        <w:rPr>
+          <w:rFonts w:ascii="Times New Roman" w:eastAsia="Times New Roman" w:hAnsi="Times New Roman" w:cs="Times New Roman"/>
+          <w:kern w:val="0"/>
+          <w14:ligatures w14:val="none"/>
+        </w:rPr>
+      </w:pPr>
+      <w:r>
+        <w:rPr>
+          <w:rFonts w:ascii="Times New Roman" w:eastAsia="Times New Roman" w:hAnsi="Times New Roman" w:cs="Times New Roman"/>
+          <w:kern w:val="0"/>
+          <w14:ligatures w14:val="none"/>
+        </w:rPr>
+        <w:t>Clarified that “Level 1” means individual device-library level, not a small or proof-only implementation.</w:t>
+      </w:r>
+    </w:p>
+    <w:p>
+      <w:pPr>
+        <w:spacing w:before="100" w:beforeAutospacing="1" w:after="100" w:afterAutospacing="1" w:line="240" w:lineRule="auto"/>
+        <w:rPr>
+          <w:rFonts w:ascii="Times New Roman" w:eastAsia="Times New Roman" w:hAnsi="Times New Roman" w:cs="Times New Roman"/>
+          <w:kern w:val="0"/>
+          <w14:ligatures w14:val="none"/>
+        </w:rPr>
+      </w:pPr>
+      <w:r>
+        <w:rPr>
+          <w:rFonts w:ascii="Times New Roman" w:eastAsia="Times New Roman" w:hAnsi="Times New Roman" w:cs="Times New Roman"/>
+          <w:kern w:val="0"/>
+          <w14:ligatures w14:val="none"/>
+        </w:rPr>
+        <w:t>Added a boundary that the agent should produce a strong standalone device API, not drift into Level 2 distributed control-system scope unless explicitly asked.</w:t>
+      </w:r>
+    </w:p>
+    <w:p>
+      <w:pPr>
+        <w:spacing w:before="100" w:beforeAutospacing="1" w:after="100" w:afterAutospacing="1" w:line="240" w:lineRule="auto"/>
+        <w:rPr>
+          <w:rFonts w:ascii="Times New Roman" w:eastAsia="Times New Roman" w:hAnsi="Times New Roman" w:cs="Times New Roman"/>
+          <w:kern w:val="0"/>
+          <w14:ligatures w14:val="none"/>
+        </w:rPr>
+      </w:pPr>
+      <w:r>
+        <w:rPr>
+          <w:rFonts w:ascii="Times New Roman" w:eastAsia="Times New Roman" w:hAnsi="Times New Roman" w:cs="Times New Roman"/>
+          <w:kern w:val="0"/>
+          <w14:ligatures w14:val="none"/>
+        </w:rPr>
+        <w:t xml:space="preserve">Good clarification — I added it directly. The draft now says </w:t>
+      </w:r>
+      <w:r>
+        <w:rPr>
+          <w:rFonts w:ascii="Times New Roman" w:eastAsia="Times New Roman" w:hAnsi="Times New Roman" w:cs="Times New Roman"/>
+          <w:b/>
+          <w:bCs/>
+          <w:kern w:val="0"/>
+          <w14:ligatures w14:val="none"/>
+        </w:rPr>
+        <w:t>Level 1 = standalone device API scope</w:t>
+      </w:r>
+      <w:r>
+        <w:rPr>
+          <w:rFonts w:ascii="Times New Roman" w:eastAsia="Times New Roman" w:hAnsi="Times New Roman" w:cs="Times New Roman"/>
+          <w:kern w:val="0"/>
+          <w14:ligatures w14:val="none"/>
+        </w:rPr>
+        <w:t>, not minimal scope, while also preventing drift into Level 2 distributed control-system work.</w:t>
+      </w:r>
+    </w:p>
+    <w:p>
+      <w:pPr>
+        <w:spacing w:before="100" w:beforeAutospacing="1" w:after="100" w:afterAutospacing="1" w:line="240" w:lineRule="auto"/>
+        <w:rPr>
+          <w:rFonts w:ascii="Times New Roman" w:eastAsia="Times New Roman" w:hAnsi="Times New Roman" w:cs="Times New Roman"/>
+          <w:kern w:val="0"/>
+          <w14:ligatures w14:val="none"/>
+        </w:rPr>
+      </w:pPr>
+      <w:r>
+        <w:rPr>
+          <w:rFonts w:ascii="Times New Roman" w:eastAsia="Times New Roman" w:hAnsi="Times New Roman" w:cs="Times New Roman"/>
+          <w:kern w:val="0"/>
+          <w14:ligatures w14:val="none"/>
+        </w:rPr>
+        <w:t xml:space="preserve">You’ll need to </w:t>
+      </w:r>
+      <w:r>
+        <w:rPr>
+          <w:rFonts w:ascii="Times New Roman" w:eastAsia="Times New Roman" w:hAnsi="Times New Roman" w:cs="Times New Roman"/>
+          <w:b/>
+          <w:bCs/>
+          <w:kern w:val="0"/>
+          <w14:ligatures w14:val="none"/>
+        </w:rPr>
+        <w:t>Update</w:t>
+      </w:r>
+      <w:r>
+        <w:rPr>
+          <w:rFonts w:ascii="Times New Roman" w:eastAsia="Times New Roman" w:hAnsi="Times New Roman" w:cs="Times New Roman"/>
+          <w:kern w:val="0"/>
+          <w14:ligatures w14:val="none"/>
+        </w:rPr>
+        <w:t xml:space="preserve"> the agent for live runs to use this latest wording.</w:t>
+      </w:r>
+    </w:p>
+    <w:p>
+      <w:pPr>
+        <w:spacing w:before="100" w:beforeAutospacing="1" w:after="100" w:afterAutospacing="1" w:line="240" w:lineRule="auto"/>
+        <w:outlineLvl w:val="4"/>
+        <w:rPr>
+          <w:rFonts w:ascii="Times New Roman" w:eastAsia="Times New Roman" w:hAnsi="Times New Roman" w:cs="Times New Roman"/>
+          <w:b/>
+          <w:bCs/>
+          <w:kern w:val="0"/>
+          <w:sz w:val="20"/>
+          <w:szCs w:val="20"/>
+          <w14:ligatures w14:val="none"/>
+        </w:rPr>
+      </w:pPr>
+      <w:r>
+        <w:rPr>
+          <w:rFonts w:ascii="Times New Roman" w:eastAsia="Times New Roman" w:hAnsi="Times New Roman" w:cs="Times New Roman"/>
+          <w:b/>
+          <w:bCs/>
+          <w:kern w:val="0"/>
+          <w:sz w:val="20"/>
+          <w:szCs w:val="20"/>
+          <w14:ligatures w14:val="none"/>
+        </w:rPr>
+        <w:t>You said:</w:t>
+      </w:r>
+    </w:p>
+    <w:p>
+      <w:pPr>
+        <w:spacing w:after="0" w:line="240" w:lineRule="auto"/>
+        <w:rPr>
+          <w:rFonts w:ascii="Times New Roman" w:eastAsia="Times New Roman" w:hAnsi="Times New Roman" w:cs="Times New Roman"/>
+          <w:kern w:val="0"/>
+          <w14:ligatures w14:val="none"/>
+        </w:rPr>
+      </w:pPr>
+      <w:r>
+        <w:rPr>
+          <w:rFonts w:ascii="Times New Roman" w:eastAsia="Times New Roman" w:hAnsi="Times New Roman" w:cs="Times New Roman"/>
+          <w:kern w:val="0"/>
+          <w14:ligatures w14:val="none"/>
+        </w:rPr>
+        <w:t>Don't be afraid to work a little while to accomplish all your goals here. You're basically doing the job of an entire software developer in this step - from writing the package to documenting it. Unless the Python package was already written, your target audience could be imagined to be the many scientists will later use this package when they buy the instrument, and then download the Python package that goes with it (this one)</w:t>
+      </w:r>
+    </w:p>
+    <w:p>
+      <w:pPr>
+        <w:spacing w:before="100" w:beforeAutospacing="1" w:after="100" w:afterAutospacing="1" w:line="240" w:lineRule="auto"/>
+        <w:outlineLvl w:val="5"/>
+        <w:rPr>
+          <w:rFonts w:ascii="Times New Roman" w:eastAsia="Times New Roman" w:hAnsi="Times New Roman" w:cs="Times New Roman"/>
+          <w:b/>
+          <w:bCs/>
+          <w:kern w:val="0"/>
+          <w:sz w:val="15"/>
+          <w:szCs w:val="15"/>
+          <w14:ligatures w14:val="none"/>
+        </w:rPr>
+      </w:pPr>
+      <w:r>
+        <w:rPr>
+          <w:rFonts w:ascii="Times New Roman" w:eastAsia="Times New Roman" w:hAnsi="Times New Roman" w:cs="Times New Roman"/>
+          <w:b/>
+          <w:bCs/>
+          <w:kern w:val="0"/>
+          <w:sz w:val="15"/>
+          <w:szCs w:val="15"/>
+          <w14:ligatures w14:val="none"/>
+        </w:rPr>
+        <w:t>The assistant said:</w:t>
+      </w:r>
+    </w:p>
+    <w:p>
+      <w:pPr>
+        <w:spacing w:after="0" w:line="240" w:lineRule="auto"/>
+        <w:rPr>
+          <w:rFonts w:ascii="Times New Roman" w:eastAsia="Times New Roman" w:hAnsi="Times New Roman" w:cs="Times New Roman"/>
+          <w:kern w:val="0"/>
+          <w14:ligatures w14:val="none"/>
+        </w:rPr>
+      </w:pPr>
+      <w:r>
+        <w:rPr>
+          <w:rFonts w:ascii="Times New Roman" w:eastAsia="Times New Roman" w:hAnsi="Times New Roman" w:cs="Times New Roman"/>
+          <w:kern w:val="0"/>
+          <w14:ligatures w14:val="none"/>
+        </w:rPr>
+        <w:t>Thought for 5s</w:t>
+      </w:r>
+    </w:p>
+    <w:p>
+      <w:pPr>
+        <w:spacing w:before="100" w:beforeAutospacing="1" w:after="100" w:afterAutospacing="1" w:line="240" w:lineRule="auto"/>
+        <w:rPr>
+          <w:rFonts w:ascii="Times New Roman" w:eastAsia="Times New Roman" w:hAnsi="Times New Roman" w:cs="Times New Roman"/>
+          <w:kern w:val="0"/>
+          <w14:ligatures w14:val="none"/>
+        </w:rPr>
+      </w:pPr>
+      <w:r>
+        <w:rPr>
+          <w:rFonts w:ascii="Times New Roman" w:eastAsia="Times New Roman" w:hAnsi="Times New Roman" w:cs="Times New Roman"/>
+          <w:kern w:val="0"/>
+          <w14:ligatures w14:val="none"/>
+        </w:rPr>
+        <w:t xml:space="preserve">I’m strengthening the instructions so the agent treats this as </w:t>
+      </w:r>
+      <w:r>
+        <w:rPr>
+          <w:rFonts w:ascii="Times New Roman" w:eastAsia="Times New Roman" w:hAnsi="Times New Roman" w:cs="Times New Roman"/>
+          <w:b/>
+          <w:bCs/>
+          <w:kern w:val="0"/>
+          <w14:ligatures w14:val="none"/>
+        </w:rPr>
+        <w:t>full software-developer-level package work</w:t>
+      </w:r>
+      <w:r>
+        <w:rPr>
+          <w:rFonts w:ascii="Times New Roman" w:eastAsia="Times New Roman" w:hAnsi="Times New Roman" w:cs="Times New Roman"/>
+          <w:kern w:val="0"/>
+          <w14:ligatures w14:val="none"/>
+        </w:rPr>
+        <w:t>, not a quick scaffold, whenever an official or prior complete Python package doesn’t already exist.</w:t>
+      </w:r>
+    </w:p>
+    <w:p>
+      <w:pPr>
+        <w:spacing w:after="0" w:line="240" w:lineRule="auto"/>
+        <w:rPr>
+          <w:rFonts w:ascii="Times New Roman" w:eastAsia="Times New Roman" w:hAnsi="Times New Roman" w:cs="Times New Roman"/>
+          <w:kern w:val="0"/>
+          <w14:ligatures w14:val="none"/>
+        </w:rPr>
+      </w:pPr>
+      <w:r>
+        <w:rPr>
+          <w:rFonts w:ascii="Times New Roman" w:eastAsia="Times New Roman" w:hAnsi="Times New Roman" w:cs="Times New Roman"/>
+          <w:kern w:val="0"/>
+          <w14:ligatures w14:val="none"/>
+        </w:rPr>
+        <w:t>Updated instructions</w:t>
+      </w:r>
+    </w:p>
+    <w:p>
+      <w:pPr>
+        <w:spacing w:after="0" w:line="240" w:lineRule="auto"/>
+        <w:rPr>
+          <w:rFonts w:ascii="Times New Roman" w:eastAsia="Times New Roman" w:hAnsi="Times New Roman" w:cs="Times New Roman"/>
+          <w:kern w:val="0"/>
+          <w14:ligatures w14:val="none"/>
+        </w:rPr>
+      </w:pPr>
+      <w:r>
+        <w:rPr>
+          <w:rFonts w:ascii="Times New Roman" w:eastAsia="Times New Roman" w:hAnsi="Times New Roman" w:cs="Times New Roman"/>
+          <w:kern w:val="0"/>
+          <w14:ligatures w14:val="none"/>
+        </w:rPr>
+        <w:t>Summary of changes</w:t>
+      </w:r>
+    </w:p>
+    <w:p>
+      <w:pPr>
+        <w:spacing w:before="100" w:beforeAutospacing="1" w:after="100" w:afterAutospacing="1" w:line="240" w:lineRule="auto"/>
+        <w:rPr>
+          <w:rFonts w:ascii="Times New Roman" w:eastAsia="Times New Roman" w:hAnsi="Times New Roman" w:cs="Times New Roman"/>
+          <w:kern w:val="0"/>
+          <w14:ligatures w14:val="none"/>
+        </w:rPr>
+      </w:pPr>
+      <w:r>
+        <w:rPr>
+          <w:rFonts w:ascii="Times New Roman" w:eastAsia="Times New Roman" w:hAnsi="Times New Roman" w:cs="Times New Roman"/>
+          <w:kern w:val="0"/>
+          <w14:ligatures w14:val="none"/>
+        </w:rPr>
+        <w:t>Clarified that when no official or prior complete Python package exists, the agent should do full software-developer-level package work: design, implementation, examples, documentation, and testing.</w:t>
+      </w:r>
+    </w:p>
+    <w:p>
+      <w:pPr>
+        <w:spacing w:before="100" w:beforeAutospacing="1" w:after="100" w:afterAutospacing="1" w:line="240" w:lineRule="auto"/>
+        <w:rPr>
+          <w:rFonts w:ascii="Times New Roman" w:eastAsia="Times New Roman" w:hAnsi="Times New Roman" w:cs="Times New Roman"/>
+          <w:kern w:val="0"/>
+          <w14:ligatures w14:val="none"/>
+        </w:rPr>
+      </w:pPr>
+      <w:r>
+        <w:rPr>
+          <w:rFonts w:ascii="Times New Roman" w:eastAsia="Times New Roman" w:hAnsi="Times New Roman" w:cs="Times New Roman"/>
+          <w:kern w:val="0"/>
+          <w14:ligatures w14:val="none"/>
+        </w:rPr>
+        <w:lastRenderedPageBreak/>
+        <w:t>Strengthened the package workflow so the agent works long enough to produce a genuinely useful vendor-quality library, not just a smoke test, minimal class, or narrow demo.</w:t>
+      </w:r>
+    </w:p>
+    <w:p>
+      <w:pPr>
+        <w:spacing w:before="100" w:beforeAutospacing="1" w:after="100" w:afterAutospacing="1" w:line="240" w:lineRule="auto"/>
+        <w:rPr>
+          <w:rFonts w:ascii="Times New Roman" w:eastAsia="Times New Roman" w:hAnsi="Times New Roman" w:cs="Times New Roman"/>
+          <w:kern w:val="0"/>
+          <w14:ligatures w14:val="none"/>
+        </w:rPr>
+      </w:pPr>
+      <w:r>
+        <w:rPr>
+          <w:rFonts w:ascii="Times New Roman" w:eastAsia="Times New Roman" w:hAnsi="Times New Roman" w:cs="Times New Roman"/>
+          <w:kern w:val="0"/>
+          <w14:ligatures w14:val="none"/>
+        </w:rPr>
+        <w:t>Added target-audience framing: scientists and technicians who buy the instrument and download this package as its normal companion library.</w:t>
+      </w:r>
+    </w:p>
+    <w:p>
+      <w:pPr>
+        <w:spacing w:before="100" w:beforeAutospacing="1" w:after="100" w:afterAutospacing="1" w:line="240" w:lineRule="auto"/>
+        <w:rPr>
+          <w:rFonts w:ascii="Times New Roman" w:eastAsia="Times New Roman" w:hAnsi="Times New Roman" w:cs="Times New Roman"/>
+          <w:kern w:val="0"/>
+          <w14:ligatures w14:val="none"/>
+        </w:rPr>
+      </w:pPr>
+      <w:r>
+        <w:rPr>
+          <w:rFonts w:ascii="Times New Roman" w:eastAsia="Times New Roman" w:hAnsi="Times New Roman" w:cs="Times New Roman"/>
+          <w:kern w:val="0"/>
+          <w14:ligatures w14:val="none"/>
+        </w:rPr>
+        <w:t>Expanded deliverable expectations to rule out placeholder packages, tutorial-only demos, and quick proofs of concept unless explicitly requested.</w:t>
+      </w:r>
+    </w:p>
+    <w:p>
+      <w:pPr>
+        <w:spacing w:before="100" w:beforeAutospacing="1" w:after="100" w:afterAutospacing="1" w:line="240" w:lineRule="auto"/>
+        <w:rPr>
+          <w:rFonts w:ascii="Times New Roman" w:eastAsia="Times New Roman" w:hAnsi="Times New Roman" w:cs="Times New Roman"/>
+          <w:kern w:val="0"/>
+          <w14:ligatures w14:val="none"/>
+        </w:rPr>
+      </w:pPr>
+      <w:r>
+        <w:rPr>
+          <w:rFonts w:ascii="Times New Roman" w:eastAsia="Times New Roman" w:hAnsi="Times New Roman" w:cs="Times New Roman"/>
+          <w:kern w:val="0"/>
+          <w14:ligatures w14:val="none"/>
+        </w:rPr>
+        <w:t xml:space="preserve">Done. This is a draft change, so click </w:t>
+      </w:r>
+      <w:r>
+        <w:rPr>
+          <w:rFonts w:ascii="Times New Roman" w:eastAsia="Times New Roman" w:hAnsi="Times New Roman" w:cs="Times New Roman"/>
+          <w:b/>
+          <w:bCs/>
+          <w:kern w:val="0"/>
+          <w14:ligatures w14:val="none"/>
+        </w:rPr>
+        <w:t>Update</w:t>
+      </w:r>
+      <w:r>
+        <w:rPr>
+          <w:rFonts w:ascii="Times New Roman" w:eastAsia="Times New Roman" w:hAnsi="Times New Roman" w:cs="Times New Roman"/>
+          <w:kern w:val="0"/>
+          <w14:ligatures w14:val="none"/>
+        </w:rPr>
+        <w:t xml:space="preserve"> when you want the live agent to use the stronger “full software developer / vendor-quality package” framing.</w:t>
       </w:r>
     </w:p>
     <w:p/>

</xml_diff>

<commit_message>
Adding explicit verification steps to Device Library Level 1; prior version made something pretty good but was not checked
</commit_message>
<xml_diff>
--- a/Design/Device Library Level 1 - Conversations/2026-09-03 Design Conversations.docx
+++ b/Design/Device Library Level 1 - Conversations/2026-09-03 Design Conversations.docx
@@ -2738,6 +2738,2426 @@
           <w14:ligatures w14:val="none"/>
         </w:rPr>
         <w:t xml:space="preserve"> when you want the live agent to use the stronger “full software developer / vendor-quality package” framing.</w:t>
+      </w:r>
+    </w:p>
+    <w:p/>
+    <w:p/>
+    <w:p/>
+    <w:p/>
+    <w:p>
+      <w:pPr>
+        <w:pStyle w:val="NormalWeb"/>
+        <w:spacing w:before="0" w:beforeAutospacing="0" w:after="0" w:afterAutospacing="0"/>
+        <w:rPr>
+          <w:rFonts w:ascii="Calibri" w:hAnsi="Calibri" w:cs="Calibri"/>
+          <w:sz w:val="22"/>
+          <w:szCs w:val="22"/>
+        </w:rPr>
+      </w:pPr>
+      <w:r>
+        <w:rPr>
+          <w:rFonts w:ascii="Calibri" w:hAnsi="Calibri" w:cs="Calibri"/>
+          <w:sz w:val="22"/>
+          <w:szCs w:val="22"/>
+        </w:rPr>
+        <w:t>› Let's say I wanted verification tests I just ran baked into my Device Library stage. Not</w:t>
+      </w:r>
+    </w:p>
+    <w:p>
+      <w:pPr>
+        <w:pStyle w:val="NormalWeb"/>
+        <w:spacing w:before="0" w:beforeAutospacing="0" w:after="0" w:afterAutospacing="0"/>
+        <w:rPr>
+          <w:rFonts w:ascii="Calibri" w:hAnsi="Calibri" w:cs="Calibri"/>
+          <w:sz w:val="22"/>
+          <w:szCs w:val="22"/>
+        </w:rPr>
+      </w:pPr>
+      <w:r>
+        <w:rPr>
+          <w:rFonts w:ascii="Calibri" w:hAnsi="Calibri" w:cs="Calibri"/>
+          <w:sz w:val="22"/>
+          <w:szCs w:val="22"/>
+        </w:rPr>
+        <w:t xml:space="preserve">  specific to any specific device - this could be any device. But, a standard set</w:t>
+      </w:r>
+    </w:p>
+    <w:p>
+      <w:pPr>
+        <w:pStyle w:val="NormalWeb"/>
+        <w:spacing w:before="0" w:beforeAutospacing="0" w:after="0" w:afterAutospacing="0"/>
+        <w:rPr>
+          <w:rFonts w:ascii="Calibri" w:hAnsi="Calibri" w:cs="Calibri"/>
+          <w:sz w:val="22"/>
+          <w:szCs w:val="22"/>
+        </w:rPr>
+      </w:pPr>
+      <w:r>
+        <w:rPr>
+          <w:rFonts w:ascii="Calibri" w:hAnsi="Calibri" w:cs="Calibri"/>
+          <w:sz w:val="22"/>
+          <w:szCs w:val="22"/>
+        </w:rPr>
+        <w:t xml:space="preserve">  of scripts verifying the work just completed, so that they can iterate and</w:t>
+      </w:r>
+    </w:p>
+    <w:p>
+      <w:pPr>
+        <w:pStyle w:val="NormalWeb"/>
+        <w:spacing w:before="0" w:beforeAutospacing="0" w:after="0" w:afterAutospacing="0"/>
+        <w:rPr>
+          <w:rFonts w:ascii="Calibri" w:hAnsi="Calibri" w:cs="Calibri"/>
+          <w:sz w:val="22"/>
+          <w:szCs w:val="22"/>
+        </w:rPr>
+      </w:pPr>
+      <w:r>
+        <w:rPr>
+          <w:rFonts w:ascii="Calibri" w:hAnsi="Calibri" w:cs="Calibri"/>
+          <w:sz w:val="22"/>
+          <w:szCs w:val="22"/>
+        </w:rPr>
+        <w:t xml:space="preserve">  fix bugs. Maybe a standard settings dump and a standard writing of data out</w:t>
+      </w:r>
+    </w:p>
+    <w:p>
+      <w:pPr>
+        <w:pStyle w:val="NormalWeb"/>
+        <w:spacing w:before="0" w:beforeAutospacing="0" w:after="0" w:afterAutospacing="0"/>
+        <w:rPr>
+          <w:rFonts w:ascii="Calibri" w:hAnsi="Calibri" w:cs="Calibri"/>
+          <w:sz w:val="22"/>
+          <w:szCs w:val="22"/>
+        </w:rPr>
+      </w:pPr>
+      <w:r>
+        <w:rPr>
+          <w:rFonts w:ascii="Calibri" w:hAnsi="Calibri" w:cs="Calibri"/>
+          <w:sz w:val="22"/>
+          <w:szCs w:val="22"/>
+        </w:rPr>
+        <w:t xml:space="preserve">  to an appropriate human-readable file (like a plot in matplotlib or an image</w:t>
+      </w:r>
+    </w:p>
+    <w:p>
+      <w:pPr>
+        <w:pStyle w:val="NormalWeb"/>
+        <w:spacing w:before="0" w:beforeAutospacing="0" w:after="0" w:afterAutospacing="0"/>
+        <w:rPr>
+          <w:rFonts w:ascii="Calibri" w:hAnsi="Calibri" w:cs="Calibri"/>
+          <w:sz w:val="22"/>
+          <w:szCs w:val="22"/>
+        </w:rPr>
+      </w:pPr>
+      <w:r>
+        <w:rPr>
+          <w:rFonts w:ascii="Calibri" w:hAnsi="Calibri" w:cs="Calibri"/>
+          <w:sz w:val="22"/>
+          <w:szCs w:val="22"/>
+        </w:rPr>
+        <w:t xml:space="preserve">  for a camera, etc.) Or, for a motor, maybe having the user actually watch the</w:t>
+      </w:r>
+    </w:p>
+    <w:p>
+      <w:pPr>
+        <w:pStyle w:val="NormalWeb"/>
+        <w:spacing w:before="0" w:beforeAutospacing="0" w:after="0" w:afterAutospacing="0"/>
+        <w:rPr>
+          <w:rFonts w:ascii="Calibri" w:hAnsi="Calibri" w:cs="Calibri"/>
+          <w:sz w:val="22"/>
+          <w:szCs w:val="22"/>
+        </w:rPr>
+      </w:pPr>
+      <w:r>
+        <w:rPr>
+          <w:rFonts w:ascii="Calibri" w:hAnsi="Calibri" w:cs="Calibri"/>
+          <w:sz w:val="22"/>
+          <w:szCs w:val="22"/>
+        </w:rPr>
+        <w:t xml:space="preserve">  physical device while they try and move the motor. How would you build an</w:t>
+      </w:r>
+    </w:p>
+    <w:p>
+      <w:pPr>
+        <w:pStyle w:val="NormalWeb"/>
+        <w:spacing w:before="0" w:beforeAutospacing="0" w:after="0" w:afterAutospacing="0"/>
+        <w:rPr>
+          <w:rFonts w:ascii="Calibri" w:hAnsi="Calibri" w:cs="Calibri"/>
+          <w:sz w:val="22"/>
+          <w:szCs w:val="22"/>
+        </w:rPr>
+      </w:pPr>
+      <w:r>
+        <w:rPr>
+          <w:rFonts w:ascii="Calibri" w:hAnsi="Calibri" w:cs="Calibri"/>
+          <w:sz w:val="22"/>
+          <w:szCs w:val="22"/>
+        </w:rPr>
+        <w:t xml:space="preserve">  agent to do this step semi-automatically? What instructions would you give to</w:t>
+      </w:r>
+    </w:p>
+    <w:p>
+      <w:pPr>
+        <w:pStyle w:val="NormalWeb"/>
+        <w:spacing w:before="0" w:beforeAutospacing="0" w:after="0" w:afterAutospacing="0"/>
+        <w:rPr>
+          <w:rFonts w:ascii="Calibri" w:hAnsi="Calibri" w:cs="Calibri"/>
+          <w:sz w:val="22"/>
+          <w:szCs w:val="22"/>
+        </w:rPr>
+      </w:pPr>
+      <w:r>
+        <w:rPr>
+          <w:rFonts w:ascii="Calibri" w:hAnsi="Calibri" w:cs="Calibri"/>
+          <w:sz w:val="22"/>
+          <w:szCs w:val="22"/>
+        </w:rPr>
+        <w:t xml:space="preserve">  append to the last software development step, so that what it makes works the</w:t>
+      </w:r>
+    </w:p>
+    <w:p>
+      <w:pPr>
+        <w:pStyle w:val="NormalWeb"/>
+        <w:spacing w:before="0" w:beforeAutospacing="0" w:after="0" w:afterAutospacing="0"/>
+        <w:rPr>
+          <w:rFonts w:ascii="Calibri" w:hAnsi="Calibri" w:cs="Calibri"/>
+          <w:sz w:val="22"/>
+          <w:szCs w:val="22"/>
+        </w:rPr>
+      </w:pPr>
+      <w:r>
+        <w:rPr>
+          <w:rFonts w:ascii="Calibri" w:hAnsi="Calibri" w:cs="Calibri"/>
+          <w:sz w:val="22"/>
+          <w:szCs w:val="22"/>
+        </w:rPr>
+        <w:t xml:space="preserve">  first time?</w:t>
+      </w:r>
+    </w:p>
+    <w:p>
+      <w:pPr>
+        <w:pStyle w:val="NormalWeb"/>
+        <w:spacing w:before="0" w:beforeAutospacing="0" w:after="0" w:afterAutospacing="0"/>
+        <w:rPr>
+          <w:rFonts w:ascii="Calibri" w:hAnsi="Calibri" w:cs="Calibri"/>
+          <w:sz w:val="22"/>
+          <w:szCs w:val="22"/>
+        </w:rPr>
+      </w:pPr>
+      <w:r>
+        <w:rPr>
+          <w:rFonts w:ascii="Calibri" w:hAnsi="Calibri" w:cs="Calibri"/>
+          <w:sz w:val="22"/>
+          <w:szCs w:val="22"/>
+        </w:rPr>
+        <w:t> </w:t>
+      </w:r>
+    </w:p>
+    <w:p>
+      <w:pPr>
+        <w:pStyle w:val="NormalWeb"/>
+        <w:spacing w:before="0" w:beforeAutospacing="0" w:after="0" w:afterAutospacing="0"/>
+        <w:rPr>
+          <w:rFonts w:ascii="Calibri" w:hAnsi="Calibri" w:cs="Calibri"/>
+          <w:sz w:val="22"/>
+          <w:szCs w:val="22"/>
+        </w:rPr>
+      </w:pPr>
+      <w:r>
+        <w:rPr>
+          <w:rFonts w:ascii="Calibri" w:hAnsi="Calibri" w:cs="Calibri"/>
+          <w:sz w:val="22"/>
+          <w:szCs w:val="22"/>
+        </w:rPr>
+        <w:t> </w:t>
+      </w:r>
+    </w:p>
+    <w:p>
+      <w:pPr>
+        <w:pStyle w:val="NormalWeb"/>
+        <w:spacing w:before="0" w:beforeAutospacing="0" w:after="0" w:afterAutospacing="0"/>
+        <w:rPr>
+          <w:rFonts w:ascii="Calibri" w:hAnsi="Calibri" w:cs="Calibri"/>
+          <w:sz w:val="22"/>
+          <w:szCs w:val="22"/>
+        </w:rPr>
+      </w:pPr>
+      <w:r>
+        <w:rPr>
+          <w:rFonts w:ascii="Calibri" w:hAnsi="Calibri" w:cs="Calibri"/>
+          <w:sz w:val="22"/>
+          <w:szCs w:val="22"/>
+        </w:rPr>
+        <w:t>• I’d add a mandatory “Human Verification Harness” phase to the end of every</w:t>
+      </w:r>
+    </w:p>
+    <w:p>
+      <w:pPr>
+        <w:pStyle w:val="NormalWeb"/>
+        <w:spacing w:before="0" w:beforeAutospacing="0" w:after="0" w:afterAutospacing="0"/>
+        <w:rPr>
+          <w:rFonts w:ascii="Calibri" w:hAnsi="Calibri" w:cs="Calibri"/>
+          <w:sz w:val="22"/>
+          <w:szCs w:val="22"/>
+        </w:rPr>
+      </w:pPr>
+      <w:r>
+        <w:rPr>
+          <w:rFonts w:ascii="Calibri" w:hAnsi="Calibri" w:cs="Calibri"/>
+          <w:sz w:val="22"/>
+          <w:szCs w:val="22"/>
+        </w:rPr>
+        <w:t xml:space="preserve">  device-library stage. Its key rule is simple: don’t merely generate scripts—</w:t>
+      </w:r>
+    </w:p>
+    <w:p>
+      <w:pPr>
+        <w:pStyle w:val="NormalWeb"/>
+        <w:spacing w:before="0" w:beforeAutospacing="0" w:after="0" w:afterAutospacing="0"/>
+        <w:rPr>
+          <w:rFonts w:ascii="Calibri" w:hAnsi="Calibri" w:cs="Calibri"/>
+          <w:sz w:val="22"/>
+          <w:szCs w:val="22"/>
+        </w:rPr>
+      </w:pPr>
+      <w:r>
+        <w:rPr>
+          <w:rFonts w:ascii="Calibri" w:hAnsi="Calibri" w:cs="Calibri"/>
+          <w:sz w:val="22"/>
+          <w:szCs w:val="22"/>
+        </w:rPr>
+        <w:t xml:space="preserve">  run the safe ones against the real device, inspect the artifacts, fix</w:t>
+      </w:r>
+    </w:p>
+    <w:p>
+      <w:pPr>
+        <w:pStyle w:val="NormalWeb"/>
+        <w:spacing w:before="0" w:beforeAutospacing="0" w:after="0" w:afterAutospacing="0"/>
+        <w:rPr>
+          <w:rFonts w:ascii="Calibri" w:hAnsi="Calibri" w:cs="Calibri"/>
+          <w:sz w:val="22"/>
+          <w:szCs w:val="22"/>
+        </w:rPr>
+      </w:pPr>
+      <w:r>
+        <w:rPr>
+          <w:rFonts w:ascii="Calibri" w:hAnsi="Calibri" w:cs="Calibri"/>
+          <w:sz w:val="22"/>
+          <w:szCs w:val="22"/>
+        </w:rPr>
+        <w:t xml:space="preserve">  failures, and rerun until they pass.</w:t>
+      </w:r>
+    </w:p>
+    <w:p>
+      <w:pPr>
+        <w:pStyle w:val="NormalWeb"/>
+        <w:spacing w:before="0" w:beforeAutospacing="0" w:after="0" w:afterAutospacing="0"/>
+        <w:rPr>
+          <w:rFonts w:ascii="Calibri" w:hAnsi="Calibri" w:cs="Calibri"/>
+          <w:sz w:val="22"/>
+          <w:szCs w:val="22"/>
+        </w:rPr>
+      </w:pPr>
+      <w:r>
+        <w:rPr>
+          <w:rFonts w:ascii="Calibri" w:hAnsi="Calibri" w:cs="Calibri"/>
+          <w:sz w:val="22"/>
+          <w:szCs w:val="22"/>
+        </w:rPr>
+        <w:t> </w:t>
+      </w:r>
+    </w:p>
+    <w:p>
+      <w:pPr>
+        <w:pStyle w:val="NormalWeb"/>
+        <w:spacing w:before="0" w:beforeAutospacing="0" w:after="0" w:afterAutospacing="0"/>
+        <w:rPr>
+          <w:rFonts w:ascii="Calibri" w:hAnsi="Calibri" w:cs="Calibri"/>
+          <w:sz w:val="22"/>
+          <w:szCs w:val="22"/>
+        </w:rPr>
+      </w:pPr>
+      <w:r>
+        <w:rPr>
+          <w:rFonts w:ascii="Calibri" w:hAnsi="Calibri" w:cs="Calibri"/>
+          <w:sz w:val="22"/>
+          <w:szCs w:val="22"/>
+        </w:rPr>
+        <w:t xml:space="preserve">  You cannot ensure “works the first time,” but you can ensure the agent catches</w:t>
+      </w:r>
+    </w:p>
+    <w:p>
+      <w:pPr>
+        <w:pStyle w:val="NormalWeb"/>
+        <w:spacing w:before="0" w:beforeAutospacing="0" w:after="0" w:afterAutospacing="0"/>
+        <w:rPr>
+          <w:rFonts w:ascii="Calibri" w:hAnsi="Calibri" w:cs="Calibri"/>
+          <w:sz w:val="22"/>
+          <w:szCs w:val="22"/>
+        </w:rPr>
+      </w:pPr>
+      <w:r>
+        <w:rPr>
+          <w:rFonts w:ascii="Calibri" w:hAnsi="Calibri" w:cs="Calibri"/>
+          <w:sz w:val="22"/>
+          <w:szCs w:val="22"/>
+        </w:rPr>
+        <w:t xml:space="preserve">  its own first failures before handoff.</w:t>
+      </w:r>
+    </w:p>
+    <w:p>
+      <w:pPr>
+        <w:pStyle w:val="NormalWeb"/>
+        <w:spacing w:before="0" w:beforeAutospacing="0" w:after="0" w:afterAutospacing="0"/>
+        <w:rPr>
+          <w:rFonts w:ascii="Calibri" w:hAnsi="Calibri" w:cs="Calibri"/>
+          <w:sz w:val="22"/>
+          <w:szCs w:val="22"/>
+        </w:rPr>
+      </w:pPr>
+      <w:r>
+        <w:rPr>
+          <w:rFonts w:ascii="Calibri" w:hAnsi="Calibri" w:cs="Calibri"/>
+          <w:sz w:val="22"/>
+          <w:szCs w:val="22"/>
+        </w:rPr>
+        <w:t> </w:t>
+      </w:r>
+    </w:p>
+    <w:p>
+      <w:pPr>
+        <w:pStyle w:val="NormalWeb"/>
+        <w:spacing w:before="0" w:beforeAutospacing="0" w:after="0" w:afterAutospacing="0"/>
+        <w:rPr>
+          <w:rFonts w:ascii="Calibri" w:hAnsi="Calibri" w:cs="Calibri"/>
+          <w:sz w:val="22"/>
+          <w:szCs w:val="22"/>
+        </w:rPr>
+      </w:pPr>
+      <w:r>
+        <w:rPr>
+          <w:rFonts w:ascii="Calibri" w:hAnsi="Calibri" w:cs="Calibri"/>
+          <w:sz w:val="22"/>
+          <w:szCs w:val="22"/>
+        </w:rPr>
+        <w:t xml:space="preserve">  Append something like this to the final software-development step:</w:t>
+      </w:r>
+    </w:p>
+    <w:p>
+      <w:pPr>
+        <w:pStyle w:val="NormalWeb"/>
+        <w:spacing w:before="0" w:beforeAutospacing="0" w:after="0" w:afterAutospacing="0"/>
+        <w:rPr>
+          <w:rFonts w:ascii="Calibri" w:hAnsi="Calibri" w:cs="Calibri"/>
+          <w:sz w:val="22"/>
+          <w:szCs w:val="22"/>
+        </w:rPr>
+      </w:pPr>
+      <w:r>
+        <w:rPr>
+          <w:rFonts w:ascii="Calibri" w:hAnsi="Calibri" w:cs="Calibri"/>
+          <w:sz w:val="22"/>
+          <w:szCs w:val="22"/>
+        </w:rPr>
+        <w:t> </w:t>
+      </w:r>
+    </w:p>
+    <w:p>
+      <w:pPr>
+        <w:pStyle w:val="NormalWeb"/>
+        <w:spacing w:before="0" w:beforeAutospacing="0" w:after="0" w:afterAutospacing="0"/>
+        <w:rPr>
+          <w:rFonts w:ascii="Calibri" w:hAnsi="Calibri" w:cs="Calibri"/>
+          <w:sz w:val="22"/>
+          <w:szCs w:val="22"/>
+        </w:rPr>
+      </w:pPr>
+      <w:r>
+        <w:rPr>
+          <w:rFonts w:ascii="Calibri" w:hAnsi="Calibri" w:cs="Calibri"/>
+          <w:sz w:val="22"/>
+          <w:szCs w:val="22"/>
+        </w:rPr>
+        <w:t xml:space="preserve">  ## Mandatory Human Verification Harness</w:t>
+      </w:r>
+    </w:p>
+    <w:p>
+      <w:pPr>
+        <w:pStyle w:val="NormalWeb"/>
+        <w:spacing w:before="0" w:beforeAutospacing="0" w:after="0" w:afterAutospacing="0"/>
+        <w:rPr>
+          <w:rFonts w:ascii="Calibri" w:hAnsi="Calibri" w:cs="Calibri"/>
+          <w:sz w:val="22"/>
+          <w:szCs w:val="22"/>
+        </w:rPr>
+      </w:pPr>
+      <w:r>
+        <w:rPr>
+          <w:rFonts w:ascii="Calibri" w:hAnsi="Calibri" w:cs="Calibri"/>
+          <w:sz w:val="22"/>
+          <w:szCs w:val="22"/>
+        </w:rPr>
+        <w:t> </w:t>
+      </w:r>
+    </w:p>
+    <w:p>
+      <w:pPr>
+        <w:pStyle w:val="NormalWeb"/>
+        <w:spacing w:before="0" w:beforeAutospacing="0" w:after="0" w:afterAutospacing="0"/>
+        <w:rPr>
+          <w:rFonts w:ascii="Calibri" w:hAnsi="Calibri" w:cs="Calibri"/>
+          <w:sz w:val="22"/>
+          <w:szCs w:val="22"/>
+        </w:rPr>
+      </w:pPr>
+      <w:r>
+        <w:rPr>
+          <w:rFonts w:ascii="Calibri" w:hAnsi="Calibri" w:cs="Calibri"/>
+          <w:sz w:val="22"/>
+          <w:szCs w:val="22"/>
+        </w:rPr>
+        <w:t xml:space="preserve">  Before declaring the device-library stage complete, create a numbered</w:t>
+      </w:r>
+    </w:p>
+    <w:p>
+      <w:pPr>
+        <w:pStyle w:val="NormalWeb"/>
+        <w:spacing w:before="0" w:beforeAutospacing="0" w:after="0" w:afterAutospacing="0"/>
+        <w:rPr>
+          <w:rFonts w:ascii="Calibri" w:hAnsi="Calibri" w:cs="Calibri"/>
+          <w:sz w:val="22"/>
+          <w:szCs w:val="22"/>
+        </w:rPr>
+      </w:pPr>
+      <w:r>
+        <w:rPr>
+          <w:rFonts w:ascii="Calibri" w:hAnsi="Calibri" w:cs="Calibri"/>
+          <w:sz w:val="22"/>
+          <w:szCs w:val="22"/>
+        </w:rPr>
+        <w:t xml:space="preserve">  `&lt;next stage&gt; - Human Verification` folder beside the library.</w:t>
+      </w:r>
+    </w:p>
+    <w:p>
+      <w:pPr>
+        <w:pStyle w:val="NormalWeb"/>
+        <w:spacing w:before="0" w:beforeAutospacing="0" w:after="0" w:afterAutospacing="0"/>
+        <w:rPr>
+          <w:rFonts w:ascii="Calibri" w:hAnsi="Calibri" w:cs="Calibri"/>
+          <w:sz w:val="22"/>
+          <w:szCs w:val="22"/>
+        </w:rPr>
+      </w:pPr>
+      <w:r>
+        <w:rPr>
+          <w:rFonts w:ascii="Calibri" w:hAnsi="Calibri" w:cs="Calibri"/>
+          <w:sz w:val="22"/>
+          <w:szCs w:val="22"/>
+        </w:rPr>
+        <w:t> </w:t>
+      </w:r>
+    </w:p>
+    <w:p>
+      <w:pPr>
+        <w:pStyle w:val="NormalWeb"/>
+        <w:spacing w:before="0" w:beforeAutospacing="0" w:after="0" w:afterAutospacing="0"/>
+        <w:rPr>
+          <w:rFonts w:ascii="Calibri" w:hAnsi="Calibri" w:cs="Calibri"/>
+          <w:sz w:val="22"/>
+          <w:szCs w:val="22"/>
+        </w:rPr>
+      </w:pPr>
+      <w:r>
+        <w:rPr>
+          <w:rFonts w:ascii="Calibri" w:hAnsi="Calibri" w:cs="Calibri"/>
+          <w:sz w:val="22"/>
+          <w:szCs w:val="22"/>
+        </w:rPr>
+        <w:t xml:space="preserve">  Build a small, runnable verification harness for the specific device. The</w:t>
+      </w:r>
+    </w:p>
+    <w:p>
+      <w:pPr>
+        <w:pStyle w:val="NormalWeb"/>
+        <w:spacing w:before="0" w:beforeAutospacing="0" w:after="0" w:afterAutospacing="0"/>
+        <w:rPr>
+          <w:rFonts w:ascii="Calibri" w:hAnsi="Calibri" w:cs="Calibri"/>
+          <w:sz w:val="22"/>
+          <w:szCs w:val="22"/>
+        </w:rPr>
+      </w:pPr>
+      <w:r>
+        <w:rPr>
+          <w:rFonts w:ascii="Calibri" w:hAnsi="Calibri" w:cs="Calibri"/>
+          <w:sz w:val="22"/>
+          <w:szCs w:val="22"/>
+        </w:rPr>
+        <w:lastRenderedPageBreak/>
+        <w:t xml:space="preserve">  harness must use the public library API—not private transport calls—so it</w:t>
+      </w:r>
+    </w:p>
+    <w:p>
+      <w:pPr>
+        <w:pStyle w:val="NormalWeb"/>
+        <w:spacing w:before="0" w:beforeAutospacing="0" w:after="0" w:afterAutospacing="0"/>
+        <w:rPr>
+          <w:rFonts w:ascii="Calibri" w:hAnsi="Calibri" w:cs="Calibri"/>
+          <w:sz w:val="22"/>
+          <w:szCs w:val="22"/>
+        </w:rPr>
+      </w:pPr>
+      <w:r>
+        <w:rPr>
+          <w:rFonts w:ascii="Calibri" w:hAnsi="Calibri" w:cs="Calibri"/>
+          <w:sz w:val="22"/>
+          <w:szCs w:val="22"/>
+        </w:rPr>
+        <w:t xml:space="preserve">  tests what the user will actually use.</w:t>
+      </w:r>
+    </w:p>
+    <w:p>
+      <w:pPr>
+        <w:pStyle w:val="NormalWeb"/>
+        <w:spacing w:before="0" w:beforeAutospacing="0" w:after="0" w:afterAutospacing="0"/>
+        <w:rPr>
+          <w:rFonts w:ascii="Calibri" w:hAnsi="Calibri" w:cs="Calibri"/>
+          <w:sz w:val="22"/>
+          <w:szCs w:val="22"/>
+        </w:rPr>
+      </w:pPr>
+      <w:r>
+        <w:rPr>
+          <w:rFonts w:ascii="Calibri" w:hAnsi="Calibri" w:cs="Calibri"/>
+          <w:sz w:val="22"/>
+          <w:szCs w:val="22"/>
+        </w:rPr>
+        <w:t> </w:t>
+      </w:r>
+    </w:p>
+    <w:p>
+      <w:pPr>
+        <w:pStyle w:val="NormalWeb"/>
+        <w:spacing w:before="0" w:beforeAutospacing="0" w:after="0" w:afterAutospacing="0"/>
+        <w:rPr>
+          <w:rFonts w:ascii="Calibri" w:hAnsi="Calibri" w:cs="Calibri"/>
+          <w:sz w:val="22"/>
+          <w:szCs w:val="22"/>
+        </w:rPr>
+      </w:pPr>
+      <w:r>
+        <w:rPr>
+          <w:rFonts w:ascii="Calibri" w:hAnsi="Calibri" w:cs="Calibri"/>
+          <w:sz w:val="22"/>
+          <w:szCs w:val="22"/>
+        </w:rPr>
+        <w:t xml:space="preserve">  ### Required deliverables</w:t>
+      </w:r>
+    </w:p>
+    <w:p>
+      <w:pPr>
+        <w:pStyle w:val="NormalWeb"/>
+        <w:spacing w:before="0" w:beforeAutospacing="0" w:after="0" w:afterAutospacing="0"/>
+        <w:rPr>
+          <w:rFonts w:ascii="Calibri" w:hAnsi="Calibri" w:cs="Calibri"/>
+          <w:sz w:val="22"/>
+          <w:szCs w:val="22"/>
+        </w:rPr>
+      </w:pPr>
+      <w:r>
+        <w:rPr>
+          <w:rFonts w:ascii="Calibri" w:hAnsi="Calibri" w:cs="Calibri"/>
+          <w:sz w:val="22"/>
+          <w:szCs w:val="22"/>
+        </w:rPr>
+        <w:t> </w:t>
+      </w:r>
+    </w:p>
+    <w:p>
+      <w:pPr>
+        <w:pStyle w:val="NormalWeb"/>
+        <w:spacing w:before="0" w:beforeAutospacing="0" w:after="0" w:afterAutospacing="0"/>
+        <w:rPr>
+          <w:rFonts w:ascii="Calibri" w:hAnsi="Calibri" w:cs="Calibri"/>
+          <w:sz w:val="22"/>
+          <w:szCs w:val="22"/>
+        </w:rPr>
+      </w:pPr>
+      <w:r>
+        <w:rPr>
+          <w:rFonts w:ascii="Calibri" w:hAnsi="Calibri" w:cs="Calibri"/>
+          <w:sz w:val="22"/>
+          <w:szCs w:val="22"/>
+        </w:rPr>
+        <w:t xml:space="preserve">  Create:</w:t>
+      </w:r>
+    </w:p>
+    <w:p>
+      <w:pPr>
+        <w:pStyle w:val="NormalWeb"/>
+        <w:spacing w:before="0" w:beforeAutospacing="0" w:after="0" w:afterAutospacing="0"/>
+        <w:rPr>
+          <w:rFonts w:ascii="Calibri" w:hAnsi="Calibri" w:cs="Calibri"/>
+          <w:sz w:val="22"/>
+          <w:szCs w:val="22"/>
+        </w:rPr>
+      </w:pPr>
+      <w:r>
+        <w:rPr>
+          <w:rFonts w:ascii="Calibri" w:hAnsi="Calibri" w:cs="Calibri"/>
+          <w:sz w:val="22"/>
+          <w:szCs w:val="22"/>
+        </w:rPr>
+        <w:t> </w:t>
+      </w:r>
+    </w:p>
+    <w:p>
+      <w:pPr>
+        <w:pStyle w:val="NormalWeb"/>
+        <w:spacing w:before="0" w:beforeAutospacing="0" w:after="0" w:afterAutospacing="0"/>
+        <w:rPr>
+          <w:rFonts w:ascii="Calibri" w:hAnsi="Calibri" w:cs="Calibri"/>
+          <w:sz w:val="22"/>
+          <w:szCs w:val="22"/>
+        </w:rPr>
+      </w:pPr>
+      <w:r>
+        <w:rPr>
+          <w:rFonts w:ascii="Calibri" w:hAnsi="Calibri" w:cs="Calibri"/>
+          <w:sz w:val="22"/>
+          <w:szCs w:val="22"/>
+        </w:rPr>
+        <w:t xml:space="preserve">  1. `scripts/verify_settings.sh`</w:t>
+      </w:r>
+    </w:p>
+    <w:p>
+      <w:pPr>
+        <w:pStyle w:val="NormalWeb"/>
+        <w:spacing w:before="0" w:beforeAutospacing="0" w:after="0" w:afterAutospacing="0"/>
+        <w:rPr>
+          <w:rFonts w:ascii="Calibri" w:hAnsi="Calibri" w:cs="Calibri"/>
+          <w:sz w:val="22"/>
+          <w:szCs w:val="22"/>
+        </w:rPr>
+      </w:pPr>
+      <w:r>
+        <w:rPr>
+          <w:rFonts w:ascii="Calibri" w:hAnsi="Calibri" w:cs="Calibri"/>
+          <w:sz w:val="22"/>
+          <w:szCs w:val="22"/>
+        </w:rPr>
+        <w:t xml:space="preserve">     - Read-only where possible.</w:t>
+      </w:r>
+    </w:p>
+    <w:p>
+      <w:pPr>
+        <w:pStyle w:val="NormalWeb"/>
+        <w:spacing w:before="0" w:beforeAutospacing="0" w:after="0" w:afterAutospacing="0"/>
+        <w:rPr>
+          <w:rFonts w:ascii="Calibri" w:hAnsi="Calibri" w:cs="Calibri"/>
+          <w:sz w:val="22"/>
+          <w:szCs w:val="22"/>
+        </w:rPr>
+      </w:pPr>
+      <w:r>
+        <w:rPr>
+          <w:rFonts w:ascii="Calibri" w:hAnsi="Calibri" w:cs="Calibri"/>
+          <w:sz w:val="22"/>
+          <w:szCs w:val="22"/>
+        </w:rPr>
+        <w:t xml:space="preserve">     - Connect to the selected device using stable discovery criteria.</w:t>
+      </w:r>
+    </w:p>
+    <w:p>
+      <w:pPr>
+        <w:pStyle w:val="NormalWeb"/>
+        <w:spacing w:before="0" w:beforeAutospacing="0" w:after="0" w:afterAutospacing="0"/>
+        <w:rPr>
+          <w:rFonts w:ascii="Calibri" w:hAnsi="Calibri" w:cs="Calibri"/>
+          <w:sz w:val="22"/>
+          <w:szCs w:val="22"/>
+        </w:rPr>
+      </w:pPr>
+      <w:r>
+        <w:rPr>
+          <w:rFonts w:ascii="Calibri" w:hAnsi="Calibri" w:cs="Calibri"/>
+          <w:sz w:val="22"/>
+          <w:szCs w:val="22"/>
+        </w:rPr>
+        <w:t xml:space="preserve">     - Query identity, firmware, connection/resource information, and the</w:t>
+      </w:r>
+    </w:p>
+    <w:p>
+      <w:pPr>
+        <w:pStyle w:val="NormalWeb"/>
+        <w:spacing w:before="0" w:beforeAutospacing="0" w:after="0" w:afterAutospacing="0"/>
+        <w:rPr>
+          <w:rFonts w:ascii="Calibri" w:hAnsi="Calibri" w:cs="Calibri"/>
+          <w:sz w:val="22"/>
+          <w:szCs w:val="22"/>
+        </w:rPr>
+      </w:pPr>
+      <w:r>
+        <w:rPr>
+          <w:rFonts w:ascii="Calibri" w:hAnsi="Calibri" w:cs="Calibri"/>
+          <w:sz w:val="22"/>
+          <w:szCs w:val="22"/>
+        </w:rPr>
+        <w:t xml:space="preserve">       routine configurable state supported by the library.</w:t>
+      </w:r>
+    </w:p>
+    <w:p>
+      <w:pPr>
+        <w:pStyle w:val="NormalWeb"/>
+        <w:spacing w:before="0" w:beforeAutospacing="0" w:after="0" w:afterAutospacing="0"/>
+        <w:rPr>
+          <w:rFonts w:ascii="Calibri" w:hAnsi="Calibri" w:cs="Calibri"/>
+          <w:sz w:val="22"/>
+          <w:szCs w:val="22"/>
+        </w:rPr>
+      </w:pPr>
+      <w:r>
+        <w:rPr>
+          <w:rFonts w:ascii="Calibri" w:hAnsi="Calibri" w:cs="Calibri"/>
+          <w:sz w:val="22"/>
+          <w:szCs w:val="22"/>
+        </w:rPr>
+        <w:t xml:space="preserve">     - Print a readable table to the terminal.</w:t>
+      </w:r>
+    </w:p>
+    <w:p>
+      <w:pPr>
+        <w:pStyle w:val="NormalWeb"/>
+        <w:spacing w:before="0" w:beforeAutospacing="0" w:after="0" w:afterAutospacing="0"/>
+        <w:rPr>
+          <w:rFonts w:ascii="Calibri" w:hAnsi="Calibri" w:cs="Calibri"/>
+          <w:sz w:val="22"/>
+          <w:szCs w:val="22"/>
+        </w:rPr>
+      </w:pPr>
+      <w:r>
+        <w:rPr>
+          <w:rFonts w:ascii="Calibri" w:hAnsi="Calibri" w:cs="Calibri"/>
+          <w:sz w:val="22"/>
+          <w:szCs w:val="22"/>
+        </w:rPr>
+        <w:t xml:space="preserve">     - Save the exact table to a timestamped human-readable file in `output/`.</w:t>
+      </w:r>
+    </w:p>
+    <w:p>
+      <w:pPr>
+        <w:pStyle w:val="NormalWeb"/>
+        <w:spacing w:before="0" w:beforeAutospacing="0" w:after="0" w:afterAutospacing="0"/>
+        <w:rPr>
+          <w:rFonts w:ascii="Calibri" w:hAnsi="Calibri" w:cs="Calibri"/>
+          <w:sz w:val="22"/>
+          <w:szCs w:val="22"/>
+        </w:rPr>
+      </w:pPr>
+      <w:r>
+        <w:rPr>
+          <w:rFonts w:ascii="Calibri" w:hAnsi="Calibri" w:cs="Calibri"/>
+          <w:sz w:val="22"/>
+          <w:szCs w:val="22"/>
+        </w:rPr>
+        <w:t> </w:t>
+      </w:r>
+    </w:p>
+    <w:p>
+      <w:pPr>
+        <w:pStyle w:val="NormalWeb"/>
+        <w:spacing w:before="0" w:beforeAutospacing="0" w:after="0" w:afterAutospacing="0"/>
+        <w:rPr>
+          <w:rFonts w:ascii="Calibri" w:hAnsi="Calibri" w:cs="Calibri"/>
+          <w:sz w:val="22"/>
+          <w:szCs w:val="22"/>
+        </w:rPr>
+      </w:pPr>
+      <w:r>
+        <w:rPr>
+          <w:rFonts w:ascii="Calibri" w:hAnsi="Calibri" w:cs="Calibri"/>
+          <w:sz w:val="22"/>
+          <w:szCs w:val="22"/>
+        </w:rPr>
+        <w:t xml:space="preserve">  2. `scripts/verify_data_product.sh`</w:t>
+      </w:r>
+    </w:p>
+    <w:p>
+      <w:pPr>
+        <w:pStyle w:val="NormalWeb"/>
+        <w:spacing w:before="0" w:beforeAutospacing="0" w:after="0" w:afterAutospacing="0"/>
+        <w:rPr>
+          <w:rFonts w:ascii="Calibri" w:hAnsi="Calibri" w:cs="Calibri"/>
+          <w:sz w:val="22"/>
+          <w:szCs w:val="22"/>
+        </w:rPr>
+      </w:pPr>
+      <w:r>
+        <w:rPr>
+          <w:rFonts w:ascii="Calibri" w:hAnsi="Calibri" w:cs="Calibri"/>
+          <w:sz w:val="22"/>
+          <w:szCs w:val="22"/>
+        </w:rPr>
+        <w:t xml:space="preserve">     - Perform the smallest documented, low-risk operation that produces the</w:t>
+      </w:r>
+    </w:p>
+    <w:p>
+      <w:pPr>
+        <w:pStyle w:val="NormalWeb"/>
+        <w:spacing w:before="0" w:beforeAutospacing="0" w:after="0" w:afterAutospacing="0"/>
+        <w:rPr>
+          <w:rFonts w:ascii="Calibri" w:hAnsi="Calibri" w:cs="Calibri"/>
+          <w:sz w:val="22"/>
+          <w:szCs w:val="22"/>
+        </w:rPr>
+      </w:pPr>
+      <w:r>
+        <w:rPr>
+          <w:rFonts w:ascii="Calibri" w:hAnsi="Calibri" w:cs="Calibri"/>
+          <w:sz w:val="22"/>
+          <w:szCs w:val="22"/>
+        </w:rPr>
+        <w:t xml:space="preserve">       device's primary data product.</w:t>
+      </w:r>
+    </w:p>
+    <w:p>
+      <w:pPr>
+        <w:pStyle w:val="NormalWeb"/>
+        <w:spacing w:before="0" w:beforeAutospacing="0" w:after="0" w:afterAutospacing="0"/>
+        <w:rPr>
+          <w:rFonts w:ascii="Calibri" w:hAnsi="Calibri" w:cs="Calibri"/>
+          <w:sz w:val="22"/>
+          <w:szCs w:val="22"/>
+        </w:rPr>
+      </w:pPr>
+      <w:r>
+        <w:rPr>
+          <w:rFonts w:ascii="Calibri" w:hAnsi="Calibri" w:cs="Calibri"/>
+          <w:sz w:val="22"/>
+          <w:szCs w:val="22"/>
+        </w:rPr>
+        <w:t xml:space="preserve">     - Save an inspectable artifact in `output/`, appropriate to the device:</w:t>
+      </w:r>
+    </w:p>
+    <w:p>
+      <w:pPr>
+        <w:pStyle w:val="NormalWeb"/>
+        <w:spacing w:before="0" w:beforeAutospacing="0" w:after="0" w:afterAutospacing="0"/>
+        <w:rPr>
+          <w:rFonts w:ascii="Calibri" w:hAnsi="Calibri" w:cs="Calibri"/>
+          <w:sz w:val="22"/>
+          <w:szCs w:val="22"/>
+        </w:rPr>
+      </w:pPr>
+      <w:r>
+        <w:rPr>
+          <w:rFonts w:ascii="Calibri" w:hAnsi="Calibri" w:cs="Calibri"/>
+          <w:sz w:val="22"/>
+          <w:szCs w:val="22"/>
+        </w:rPr>
+        <w:t xml:space="preserve">       - scope/sensor: CSV and/or plot;</w:t>
+      </w:r>
+    </w:p>
+    <w:p>
+      <w:pPr>
+        <w:pStyle w:val="NormalWeb"/>
+        <w:spacing w:before="0" w:beforeAutospacing="0" w:after="0" w:afterAutospacing="0"/>
+        <w:rPr>
+          <w:rFonts w:ascii="Calibri" w:hAnsi="Calibri" w:cs="Calibri"/>
+          <w:sz w:val="22"/>
+          <w:szCs w:val="22"/>
+        </w:rPr>
+      </w:pPr>
+      <w:r>
+        <w:rPr>
+          <w:rFonts w:ascii="Calibri" w:hAnsi="Calibri" w:cs="Calibri"/>
+          <w:sz w:val="22"/>
+          <w:szCs w:val="22"/>
+        </w:rPr>
+        <w:t xml:space="preserve">       - camera: PNG/TIFF/JPEG;</w:t>
+      </w:r>
+    </w:p>
+    <w:p>
+      <w:pPr>
+        <w:pStyle w:val="NormalWeb"/>
+        <w:spacing w:before="0" w:beforeAutospacing="0" w:after="0" w:afterAutospacing="0"/>
+        <w:rPr>
+          <w:rFonts w:ascii="Calibri" w:hAnsi="Calibri" w:cs="Calibri"/>
+          <w:sz w:val="22"/>
+          <w:szCs w:val="22"/>
+        </w:rPr>
+      </w:pPr>
+      <w:r>
+        <w:rPr>
+          <w:rFonts w:ascii="Calibri" w:hAnsi="Calibri" w:cs="Calibri"/>
+          <w:sz w:val="22"/>
+          <w:szCs w:val="22"/>
+        </w:rPr>
+        <w:t xml:space="preserve">       - spectrometer: CSV plus plot;</w:t>
+      </w:r>
+    </w:p>
+    <w:p>
+      <w:pPr>
+        <w:pStyle w:val="NormalWeb"/>
+        <w:spacing w:before="0" w:beforeAutospacing="0" w:after="0" w:afterAutospacing="0"/>
+        <w:rPr>
+          <w:rFonts w:ascii="Calibri" w:hAnsi="Calibri" w:cs="Calibri"/>
+          <w:sz w:val="22"/>
+          <w:szCs w:val="22"/>
+        </w:rPr>
+      </w:pPr>
+      <w:r>
+        <w:rPr>
+          <w:rFonts w:ascii="Calibri" w:hAnsi="Calibri" w:cs="Calibri"/>
+          <w:sz w:val="22"/>
+          <w:szCs w:val="22"/>
+        </w:rPr>
+        <w:t xml:space="preserve">       - environmental device: timestamped CSV/table;</w:t>
+      </w:r>
+    </w:p>
+    <w:p>
+      <w:pPr>
+        <w:pStyle w:val="NormalWeb"/>
+        <w:spacing w:before="0" w:beforeAutospacing="0" w:after="0" w:afterAutospacing="0"/>
+        <w:rPr>
+          <w:rFonts w:ascii="Calibri" w:hAnsi="Calibri" w:cs="Calibri"/>
+          <w:sz w:val="22"/>
+          <w:szCs w:val="22"/>
+        </w:rPr>
+      </w:pPr>
+      <w:r>
+        <w:rPr>
+          <w:rFonts w:ascii="Calibri" w:hAnsi="Calibri" w:cs="Calibri"/>
+          <w:sz w:val="22"/>
+          <w:szCs w:val="22"/>
+        </w:rPr>
+        <w:t xml:space="preserve">       - motor/stage: before/after position report;</w:t>
+      </w:r>
+    </w:p>
+    <w:p>
+      <w:pPr>
+        <w:pStyle w:val="NormalWeb"/>
+        <w:spacing w:before="0" w:beforeAutospacing="0" w:after="0" w:afterAutospacing="0"/>
+        <w:rPr>
+          <w:rFonts w:ascii="Calibri" w:hAnsi="Calibri" w:cs="Calibri"/>
+          <w:sz w:val="22"/>
+          <w:szCs w:val="22"/>
+        </w:rPr>
+      </w:pPr>
+      <w:r>
+        <w:rPr>
+          <w:rFonts w:ascii="Calibri" w:hAnsi="Calibri" w:cs="Calibri"/>
+          <w:sz w:val="22"/>
+          <w:szCs w:val="22"/>
+        </w:rPr>
+        <w:t xml:space="preserve">       - actuator without a data product: timestamped command/result log.</w:t>
+      </w:r>
+    </w:p>
+    <w:p>
+      <w:pPr>
+        <w:pStyle w:val="NormalWeb"/>
+        <w:spacing w:before="0" w:beforeAutospacing="0" w:after="0" w:afterAutospacing="0"/>
+        <w:rPr>
+          <w:rFonts w:ascii="Calibri" w:hAnsi="Calibri" w:cs="Calibri"/>
+          <w:sz w:val="22"/>
+          <w:szCs w:val="22"/>
+        </w:rPr>
+      </w:pPr>
+      <w:r>
+        <w:rPr>
+          <w:rFonts w:ascii="Calibri" w:hAnsi="Calibri" w:cs="Calibri"/>
+          <w:sz w:val="22"/>
+          <w:szCs w:val="22"/>
+        </w:rPr>
+        <w:t xml:space="preserve">     - The artifact must identify device model, serial number, host timestamp,</w:t>
+      </w:r>
+    </w:p>
+    <w:p>
+      <w:pPr>
+        <w:pStyle w:val="NormalWeb"/>
+        <w:spacing w:before="0" w:beforeAutospacing="0" w:after="0" w:afterAutospacing="0"/>
+        <w:rPr>
+          <w:rFonts w:ascii="Calibri" w:hAnsi="Calibri" w:cs="Calibri"/>
+          <w:sz w:val="22"/>
+          <w:szCs w:val="22"/>
+        </w:rPr>
+      </w:pPr>
+      <w:r>
+        <w:rPr>
+          <w:rFonts w:ascii="Calibri" w:hAnsi="Calibri" w:cs="Calibri"/>
+          <w:sz w:val="22"/>
+          <w:szCs w:val="22"/>
+        </w:rPr>
+        <w:t xml:space="preserve">       configuration summary, and units/provenance where available.</w:t>
+      </w:r>
+    </w:p>
+    <w:p>
+      <w:pPr>
+        <w:pStyle w:val="NormalWeb"/>
+        <w:spacing w:before="0" w:beforeAutospacing="0" w:after="0" w:afterAutospacing="0"/>
+        <w:rPr>
+          <w:rFonts w:ascii="Calibri" w:hAnsi="Calibri" w:cs="Calibri"/>
+          <w:sz w:val="22"/>
+          <w:szCs w:val="22"/>
+        </w:rPr>
+      </w:pPr>
+      <w:r>
+        <w:rPr>
+          <w:rFonts w:ascii="Calibri" w:hAnsi="Calibri" w:cs="Calibri"/>
+          <w:sz w:val="22"/>
+          <w:szCs w:val="22"/>
+        </w:rPr>
+        <w:t xml:space="preserve">     - Do not present raw codes as calibrated physical units unless conversion</w:t>
+      </w:r>
+    </w:p>
+    <w:p>
+      <w:pPr>
+        <w:pStyle w:val="NormalWeb"/>
+        <w:spacing w:before="0" w:beforeAutospacing="0" w:after="0" w:afterAutospacing="0"/>
+        <w:rPr>
+          <w:rFonts w:ascii="Calibri" w:hAnsi="Calibri" w:cs="Calibri"/>
+          <w:sz w:val="22"/>
+          <w:szCs w:val="22"/>
+        </w:rPr>
+      </w:pPr>
+      <w:r>
+        <w:rPr>
+          <w:rFonts w:ascii="Calibri" w:hAnsi="Calibri" w:cs="Calibri"/>
+          <w:sz w:val="22"/>
+          <w:szCs w:val="22"/>
+        </w:rPr>
+        <w:t xml:space="preserve">       is documented and validated.</w:t>
+      </w:r>
+    </w:p>
+    <w:p>
+      <w:pPr>
+        <w:pStyle w:val="NormalWeb"/>
+        <w:spacing w:before="0" w:beforeAutospacing="0" w:after="0" w:afterAutospacing="0"/>
+        <w:rPr>
+          <w:rFonts w:ascii="Calibri" w:hAnsi="Calibri" w:cs="Calibri"/>
+          <w:sz w:val="22"/>
+          <w:szCs w:val="22"/>
+        </w:rPr>
+      </w:pPr>
+      <w:r>
+        <w:rPr>
+          <w:rFonts w:ascii="Calibri" w:hAnsi="Calibri" w:cs="Calibri"/>
+          <w:sz w:val="22"/>
+          <w:szCs w:val="22"/>
+        </w:rPr>
+        <w:t> </w:t>
+      </w:r>
+    </w:p>
+    <w:p>
+      <w:pPr>
+        <w:pStyle w:val="NormalWeb"/>
+        <w:spacing w:before="0" w:beforeAutospacing="0" w:after="0" w:afterAutospacing="0"/>
+        <w:rPr>
+          <w:rFonts w:ascii="Calibri" w:hAnsi="Calibri" w:cs="Calibri"/>
+          <w:sz w:val="22"/>
+          <w:szCs w:val="22"/>
+        </w:rPr>
+      </w:pPr>
+      <w:r>
+        <w:rPr>
+          <w:rFonts w:ascii="Calibri" w:hAnsi="Calibri" w:cs="Calibri"/>
+          <w:sz w:val="22"/>
+          <w:szCs w:val="22"/>
+        </w:rPr>
+        <w:t xml:space="preserve">  3. `README-Human-Verification.md`</w:t>
+      </w:r>
+    </w:p>
+    <w:p>
+      <w:pPr>
+        <w:pStyle w:val="NormalWeb"/>
+        <w:spacing w:before="0" w:beforeAutospacing="0" w:after="0" w:afterAutospacing="0"/>
+        <w:rPr>
+          <w:rFonts w:ascii="Calibri" w:hAnsi="Calibri" w:cs="Calibri"/>
+          <w:sz w:val="22"/>
+          <w:szCs w:val="22"/>
+        </w:rPr>
+      </w:pPr>
+      <w:r>
+        <w:rPr>
+          <w:rFonts w:ascii="Calibri" w:hAnsi="Calibri" w:cs="Calibri"/>
+          <w:sz w:val="22"/>
+          <w:szCs w:val="22"/>
+        </w:rPr>
+        <w:t xml:space="preserve">     - Exact commands to run.</w:t>
+      </w:r>
+    </w:p>
+    <w:p>
+      <w:pPr>
+        <w:pStyle w:val="NormalWeb"/>
+        <w:spacing w:before="0" w:beforeAutospacing="0" w:after="0" w:afterAutospacing="0"/>
+        <w:rPr>
+          <w:rFonts w:ascii="Calibri" w:hAnsi="Calibri" w:cs="Calibri"/>
+          <w:sz w:val="22"/>
+          <w:szCs w:val="22"/>
+        </w:rPr>
+      </w:pPr>
+      <w:r>
+        <w:rPr>
+          <w:rFonts w:ascii="Calibri" w:hAnsi="Calibri" w:cs="Calibri"/>
+          <w:sz w:val="22"/>
+          <w:szCs w:val="22"/>
+        </w:rPr>
+        <w:t xml:space="preserve">     - Expected safe behavior.</w:t>
+      </w:r>
+    </w:p>
+    <w:p>
+      <w:pPr>
+        <w:pStyle w:val="NormalWeb"/>
+        <w:spacing w:before="0" w:beforeAutospacing="0" w:after="0" w:afterAutospacing="0"/>
+        <w:rPr>
+          <w:rFonts w:ascii="Calibri" w:hAnsi="Calibri" w:cs="Calibri"/>
+          <w:sz w:val="22"/>
+          <w:szCs w:val="22"/>
+        </w:rPr>
+      </w:pPr>
+      <w:r>
+        <w:rPr>
+          <w:rFonts w:ascii="Calibri" w:hAnsi="Calibri" w:cs="Calibri"/>
+          <w:sz w:val="22"/>
+          <w:szCs w:val="22"/>
+        </w:rPr>
+        <w:t xml:space="preserve">     - Output locations.</w:t>
+      </w:r>
+    </w:p>
+    <w:p>
+      <w:pPr>
+        <w:pStyle w:val="NormalWeb"/>
+        <w:spacing w:before="0" w:beforeAutospacing="0" w:after="0" w:afterAutospacing="0"/>
+        <w:rPr>
+          <w:rFonts w:ascii="Calibri" w:hAnsi="Calibri" w:cs="Calibri"/>
+          <w:sz w:val="22"/>
+          <w:szCs w:val="22"/>
+        </w:rPr>
+      </w:pPr>
+      <w:r>
+        <w:rPr>
+          <w:rFonts w:ascii="Calibri" w:hAnsi="Calibri" w:cs="Calibri"/>
+          <w:sz w:val="22"/>
+          <w:szCs w:val="22"/>
+        </w:rPr>
+        <w:t xml:space="preserve">     - Known limitations and prerequisites.</w:t>
+      </w:r>
+    </w:p>
+    <w:p>
+      <w:pPr>
+        <w:pStyle w:val="NormalWeb"/>
+        <w:spacing w:before="0" w:beforeAutospacing="0" w:after="0" w:afterAutospacing="0"/>
+        <w:rPr>
+          <w:rFonts w:ascii="Calibri" w:hAnsi="Calibri" w:cs="Calibri"/>
+          <w:sz w:val="22"/>
+          <w:szCs w:val="22"/>
+        </w:rPr>
+      </w:pPr>
+      <w:r>
+        <w:rPr>
+          <w:rFonts w:ascii="Calibri" w:hAnsi="Calibri" w:cs="Calibri"/>
+          <w:sz w:val="22"/>
+          <w:szCs w:val="22"/>
+        </w:rPr>
+        <w:t xml:space="preserve">     - A short explanation of what the verification does and does not prove.</w:t>
+      </w:r>
+    </w:p>
+    <w:p>
+      <w:pPr>
+        <w:pStyle w:val="NormalWeb"/>
+        <w:spacing w:before="0" w:beforeAutospacing="0" w:after="0" w:afterAutospacing="0"/>
+        <w:rPr>
+          <w:rFonts w:ascii="Calibri" w:hAnsi="Calibri" w:cs="Calibri"/>
+          <w:sz w:val="22"/>
+          <w:szCs w:val="22"/>
+        </w:rPr>
+      </w:pPr>
+      <w:r>
+        <w:rPr>
+          <w:rFonts w:ascii="Calibri" w:hAnsi="Calibri" w:cs="Calibri"/>
+          <w:sz w:val="22"/>
+          <w:szCs w:val="22"/>
+        </w:rPr>
+        <w:t> </w:t>
+      </w:r>
+    </w:p>
+    <w:p>
+      <w:pPr>
+        <w:pStyle w:val="NormalWeb"/>
+        <w:spacing w:before="0" w:beforeAutospacing="0" w:after="0" w:afterAutospacing="0"/>
+        <w:rPr>
+          <w:rFonts w:ascii="Calibri" w:hAnsi="Calibri" w:cs="Calibri"/>
+          <w:sz w:val="22"/>
+          <w:szCs w:val="22"/>
+        </w:rPr>
+      </w:pPr>
+      <w:r>
+        <w:rPr>
+          <w:rFonts w:ascii="Calibri" w:hAnsi="Calibri" w:cs="Calibri"/>
+          <w:sz w:val="22"/>
+          <w:szCs w:val="22"/>
+        </w:rPr>
+        <w:t xml:space="preserve">  ### Test before handoff</w:t>
+      </w:r>
+    </w:p>
+    <w:p>
+      <w:pPr>
+        <w:pStyle w:val="NormalWeb"/>
+        <w:spacing w:before="0" w:beforeAutospacing="0" w:after="0" w:afterAutospacing="0"/>
+        <w:rPr>
+          <w:rFonts w:ascii="Calibri" w:hAnsi="Calibri" w:cs="Calibri"/>
+          <w:sz w:val="22"/>
+          <w:szCs w:val="22"/>
+        </w:rPr>
+      </w:pPr>
+      <w:r>
+        <w:rPr>
+          <w:rFonts w:ascii="Calibri" w:hAnsi="Calibri" w:cs="Calibri"/>
+          <w:sz w:val="22"/>
+          <w:szCs w:val="22"/>
+        </w:rPr>
+        <w:t> </w:t>
+      </w:r>
+    </w:p>
+    <w:p>
+      <w:pPr>
+        <w:pStyle w:val="NormalWeb"/>
+        <w:spacing w:before="0" w:beforeAutospacing="0" w:after="0" w:afterAutospacing="0"/>
+        <w:rPr>
+          <w:rFonts w:ascii="Calibri" w:hAnsi="Calibri" w:cs="Calibri"/>
+          <w:sz w:val="22"/>
+          <w:szCs w:val="22"/>
+        </w:rPr>
+      </w:pPr>
+      <w:r>
+        <w:rPr>
+          <w:rFonts w:ascii="Calibri" w:hAnsi="Calibri" w:cs="Calibri"/>
+          <w:sz w:val="22"/>
+          <w:szCs w:val="22"/>
+        </w:rPr>
+        <w:t xml:space="preserve">  The agent must execute every verification script it creates when the required</w:t>
+      </w:r>
+    </w:p>
+    <w:p>
+      <w:pPr>
+        <w:pStyle w:val="NormalWeb"/>
+        <w:spacing w:before="0" w:beforeAutospacing="0" w:after="0" w:afterAutospacing="0"/>
+        <w:rPr>
+          <w:rFonts w:ascii="Calibri" w:hAnsi="Calibri" w:cs="Calibri"/>
+          <w:sz w:val="22"/>
+          <w:szCs w:val="22"/>
+        </w:rPr>
+      </w:pPr>
+      <w:r>
+        <w:rPr>
+          <w:rFonts w:ascii="Calibri" w:hAnsi="Calibri" w:cs="Calibri"/>
+          <w:sz w:val="22"/>
+          <w:szCs w:val="22"/>
+        </w:rPr>
+        <w:t xml:space="preserve">  hardware is visible and the operation is within the previously approved safety</w:t>
+      </w:r>
+    </w:p>
+    <w:p>
+      <w:pPr>
+        <w:pStyle w:val="NormalWeb"/>
+        <w:spacing w:before="0" w:beforeAutospacing="0" w:after="0" w:afterAutospacing="0"/>
+        <w:rPr>
+          <w:rFonts w:ascii="Calibri" w:hAnsi="Calibri" w:cs="Calibri"/>
+          <w:sz w:val="22"/>
+          <w:szCs w:val="22"/>
+        </w:rPr>
+      </w:pPr>
+      <w:r>
+        <w:rPr>
+          <w:rFonts w:ascii="Calibri" w:hAnsi="Calibri" w:cs="Calibri"/>
+          <w:sz w:val="22"/>
+          <w:szCs w:val="22"/>
+        </w:rPr>
+        <w:t xml:space="preserve">  scope.</w:t>
+      </w:r>
+    </w:p>
+    <w:p>
+      <w:pPr>
+        <w:pStyle w:val="NormalWeb"/>
+        <w:spacing w:before="0" w:beforeAutospacing="0" w:after="0" w:afterAutospacing="0"/>
+        <w:rPr>
+          <w:rFonts w:ascii="Calibri" w:hAnsi="Calibri" w:cs="Calibri"/>
+          <w:sz w:val="22"/>
+          <w:szCs w:val="22"/>
+        </w:rPr>
+      </w:pPr>
+      <w:r>
+        <w:rPr>
+          <w:rFonts w:ascii="Calibri" w:hAnsi="Calibri" w:cs="Calibri"/>
+          <w:sz w:val="22"/>
+          <w:szCs w:val="22"/>
+        </w:rPr>
+        <w:t> </w:t>
+      </w:r>
+    </w:p>
+    <w:p>
+      <w:pPr>
+        <w:pStyle w:val="NormalWeb"/>
+        <w:spacing w:before="0" w:beforeAutospacing="0" w:after="0" w:afterAutospacing="0"/>
+        <w:rPr>
+          <w:rFonts w:ascii="Calibri" w:hAnsi="Calibri" w:cs="Calibri"/>
+          <w:sz w:val="22"/>
+          <w:szCs w:val="22"/>
+        </w:rPr>
+      </w:pPr>
+      <w:r>
+        <w:rPr>
+          <w:rFonts w:ascii="Calibri" w:hAnsi="Calibri" w:cs="Calibri"/>
+          <w:sz w:val="22"/>
+          <w:szCs w:val="22"/>
+        </w:rPr>
+        <w:t xml:space="preserve">  For each script:</w:t>
+      </w:r>
+    </w:p>
+    <w:p>
+      <w:pPr>
+        <w:pStyle w:val="NormalWeb"/>
+        <w:spacing w:before="0" w:beforeAutospacing="0" w:after="0" w:afterAutospacing="0"/>
+        <w:rPr>
+          <w:rFonts w:ascii="Calibri" w:hAnsi="Calibri" w:cs="Calibri"/>
+          <w:sz w:val="22"/>
+          <w:szCs w:val="22"/>
+        </w:rPr>
+      </w:pPr>
+      <w:r>
+        <w:rPr>
+          <w:rFonts w:ascii="Calibri" w:hAnsi="Calibri" w:cs="Calibri"/>
+          <w:sz w:val="22"/>
+          <w:szCs w:val="22"/>
+        </w:rPr>
+        <w:t> </w:t>
+      </w:r>
+    </w:p>
+    <w:p>
+      <w:pPr>
+        <w:pStyle w:val="NormalWeb"/>
+        <w:spacing w:before="0" w:beforeAutospacing="0" w:after="0" w:afterAutospacing="0"/>
+        <w:rPr>
+          <w:rFonts w:ascii="Calibri" w:hAnsi="Calibri" w:cs="Calibri"/>
+          <w:sz w:val="22"/>
+          <w:szCs w:val="22"/>
+        </w:rPr>
+      </w:pPr>
+      <w:r>
+        <w:rPr>
+          <w:rFonts w:ascii="Calibri" w:hAnsi="Calibri" w:cs="Calibri"/>
+          <w:sz w:val="22"/>
+          <w:szCs w:val="22"/>
+        </w:rPr>
+        <w:t xml:space="preserve">  1. Record the device state needed for restoration.</w:t>
+      </w:r>
+    </w:p>
+    <w:p>
+      <w:pPr>
+        <w:pStyle w:val="NormalWeb"/>
+        <w:spacing w:before="0" w:beforeAutospacing="0" w:after="0" w:afterAutospacing="0"/>
+        <w:rPr>
+          <w:rFonts w:ascii="Calibri" w:hAnsi="Calibri" w:cs="Calibri"/>
+          <w:sz w:val="22"/>
+          <w:szCs w:val="22"/>
+        </w:rPr>
+      </w:pPr>
+      <w:r>
+        <w:rPr>
+          <w:rFonts w:ascii="Calibri" w:hAnsi="Calibri" w:cs="Calibri"/>
+          <w:sz w:val="22"/>
+          <w:szCs w:val="22"/>
+        </w:rPr>
+        <w:t xml:space="preserve">  2. Run the script through the public package API.</w:t>
+      </w:r>
+    </w:p>
+    <w:p>
+      <w:pPr>
+        <w:pStyle w:val="NormalWeb"/>
+        <w:spacing w:before="0" w:beforeAutospacing="0" w:after="0" w:afterAutospacing="0"/>
+        <w:rPr>
+          <w:rFonts w:ascii="Calibri" w:hAnsi="Calibri" w:cs="Calibri"/>
+          <w:sz w:val="22"/>
+          <w:szCs w:val="22"/>
+        </w:rPr>
+      </w:pPr>
+      <w:r>
+        <w:rPr>
+          <w:rFonts w:ascii="Calibri" w:hAnsi="Calibri" w:cs="Calibri"/>
+          <w:sz w:val="22"/>
+          <w:szCs w:val="22"/>
+        </w:rPr>
+        <w:t xml:space="preserve">  3. Confirm the expected output file exists, is non-empty, and is parseable.</w:t>
+      </w:r>
+    </w:p>
+    <w:p>
+      <w:pPr>
+        <w:pStyle w:val="NormalWeb"/>
+        <w:spacing w:before="0" w:beforeAutospacing="0" w:after="0" w:afterAutospacing="0"/>
+        <w:rPr>
+          <w:rFonts w:ascii="Calibri" w:hAnsi="Calibri" w:cs="Calibri"/>
+          <w:sz w:val="22"/>
+          <w:szCs w:val="22"/>
+        </w:rPr>
+      </w:pPr>
+      <w:r>
+        <w:rPr>
+          <w:rFonts w:ascii="Calibri" w:hAnsi="Calibri" w:cs="Calibri"/>
+          <w:sz w:val="22"/>
+          <w:szCs w:val="22"/>
+        </w:rPr>
+        <w:lastRenderedPageBreak/>
+        <w:t xml:space="preserve">  4. Inspect the output:</w:t>
+      </w:r>
+    </w:p>
+    <w:p>
+      <w:pPr>
+        <w:pStyle w:val="NormalWeb"/>
+        <w:spacing w:before="0" w:beforeAutospacing="0" w:after="0" w:afterAutospacing="0"/>
+        <w:rPr>
+          <w:rFonts w:ascii="Calibri" w:hAnsi="Calibri" w:cs="Calibri"/>
+          <w:sz w:val="22"/>
+          <w:szCs w:val="22"/>
+        </w:rPr>
+      </w:pPr>
+      <w:r>
+        <w:rPr>
+          <w:rFonts w:ascii="Calibri" w:hAnsi="Calibri" w:cs="Calibri"/>
+          <w:sz w:val="22"/>
+          <w:szCs w:val="22"/>
+        </w:rPr>
+        <w:t xml:space="preserve">     - parse CSV/JSON/tables;</w:t>
+      </w:r>
+    </w:p>
+    <w:p>
+      <w:pPr>
+        <w:pStyle w:val="NormalWeb"/>
+        <w:spacing w:before="0" w:beforeAutospacing="0" w:after="0" w:afterAutospacing="0"/>
+        <w:rPr>
+          <w:rFonts w:ascii="Calibri" w:hAnsi="Calibri" w:cs="Calibri"/>
+          <w:sz w:val="22"/>
+          <w:szCs w:val="22"/>
+        </w:rPr>
+      </w:pPr>
+      <w:r>
+        <w:rPr>
+          <w:rFonts w:ascii="Calibri" w:hAnsi="Calibri" w:cs="Calibri"/>
+          <w:sz w:val="22"/>
+          <w:szCs w:val="22"/>
+        </w:rPr>
+        <w:t xml:space="preserve">     - open/render image or plot artifacts;</w:t>
+      </w:r>
+    </w:p>
+    <w:p>
+      <w:pPr>
+        <w:pStyle w:val="NormalWeb"/>
+        <w:spacing w:before="0" w:beforeAutospacing="0" w:after="0" w:afterAutospacing="0"/>
+        <w:rPr>
+          <w:rFonts w:ascii="Calibri" w:hAnsi="Calibri" w:cs="Calibri"/>
+          <w:sz w:val="22"/>
+          <w:szCs w:val="22"/>
+        </w:rPr>
+      </w:pPr>
+      <w:r>
+        <w:rPr>
+          <w:rFonts w:ascii="Calibri" w:hAnsi="Calibri" w:cs="Calibri"/>
+          <w:sz w:val="22"/>
+          <w:szCs w:val="22"/>
+        </w:rPr>
+        <w:t xml:space="preserve">     - confirm expected dimensions, point count, metadata, and timestamps.</w:t>
+      </w:r>
+    </w:p>
+    <w:p>
+      <w:pPr>
+        <w:pStyle w:val="NormalWeb"/>
+        <w:spacing w:before="0" w:beforeAutospacing="0" w:after="0" w:afterAutospacing="0"/>
+        <w:rPr>
+          <w:rFonts w:ascii="Calibri" w:hAnsi="Calibri" w:cs="Calibri"/>
+          <w:sz w:val="22"/>
+          <w:szCs w:val="22"/>
+        </w:rPr>
+      </w:pPr>
+      <w:r>
+        <w:rPr>
+          <w:rFonts w:ascii="Calibri" w:hAnsi="Calibri" w:cs="Calibri"/>
+          <w:sz w:val="22"/>
+          <w:szCs w:val="22"/>
+        </w:rPr>
+        <w:t xml:space="preserve">  5. Confirm any temporary device setting was restored with a fresh device</w:t>
+      </w:r>
+    </w:p>
+    <w:p>
+      <w:pPr>
+        <w:pStyle w:val="NormalWeb"/>
+        <w:spacing w:before="0" w:beforeAutospacing="0" w:after="0" w:afterAutospacing="0"/>
+        <w:rPr>
+          <w:rFonts w:ascii="Calibri" w:hAnsi="Calibri" w:cs="Calibri"/>
+          <w:sz w:val="22"/>
+          <w:szCs w:val="22"/>
+        </w:rPr>
+      </w:pPr>
+      <w:r>
+        <w:rPr>
+          <w:rFonts w:ascii="Calibri" w:hAnsi="Calibri" w:cs="Calibri"/>
+          <w:sz w:val="22"/>
+          <w:szCs w:val="22"/>
+        </w:rPr>
+        <w:t xml:space="preserve">  query.</w:t>
+      </w:r>
+    </w:p>
+    <w:p>
+      <w:pPr>
+        <w:pStyle w:val="NormalWeb"/>
+        <w:spacing w:before="0" w:beforeAutospacing="0" w:after="0" w:afterAutospacing="0"/>
+        <w:rPr>
+          <w:rFonts w:ascii="Calibri" w:hAnsi="Calibri" w:cs="Calibri"/>
+          <w:sz w:val="22"/>
+          <w:szCs w:val="22"/>
+        </w:rPr>
+      </w:pPr>
+      <w:r>
+        <w:rPr>
+          <w:rFonts w:ascii="Calibri" w:hAnsi="Calibri" w:cs="Calibri"/>
+          <w:sz w:val="22"/>
+          <w:szCs w:val="22"/>
+        </w:rPr>
+        <w:t xml:space="preserve">  6. Save terminal output, test result, and generated artifacts in `output/`.</w:t>
+      </w:r>
+    </w:p>
+    <w:p>
+      <w:pPr>
+        <w:pStyle w:val="NormalWeb"/>
+        <w:spacing w:before="0" w:beforeAutospacing="0" w:after="0" w:afterAutospacing="0"/>
+        <w:rPr>
+          <w:rFonts w:ascii="Calibri" w:hAnsi="Calibri" w:cs="Calibri"/>
+          <w:sz w:val="22"/>
+          <w:szCs w:val="22"/>
+        </w:rPr>
+      </w:pPr>
+      <w:r>
+        <w:rPr>
+          <w:rFonts w:ascii="Calibri" w:hAnsi="Calibri" w:cs="Calibri"/>
+          <w:sz w:val="22"/>
+          <w:szCs w:val="22"/>
+        </w:rPr>
+        <w:t xml:space="preserve">  7. If any part fails, diagnose, fix the library or script, rerun the affected</w:t>
+      </w:r>
+    </w:p>
+    <w:p>
+      <w:pPr>
+        <w:pStyle w:val="NormalWeb"/>
+        <w:spacing w:before="0" w:beforeAutospacing="0" w:after="0" w:afterAutospacing="0"/>
+        <w:rPr>
+          <w:rFonts w:ascii="Calibri" w:hAnsi="Calibri" w:cs="Calibri"/>
+          <w:sz w:val="22"/>
+          <w:szCs w:val="22"/>
+        </w:rPr>
+      </w:pPr>
+      <w:r>
+        <w:rPr>
+          <w:rFonts w:ascii="Calibri" w:hAnsi="Calibri" w:cs="Calibri"/>
+          <w:sz w:val="22"/>
+          <w:szCs w:val="22"/>
+        </w:rPr>
+        <w:t xml:space="preserve">     unit tests, then rerun the real-device verification. Do not declare</w:t>
+      </w:r>
+    </w:p>
+    <w:p>
+      <w:pPr>
+        <w:pStyle w:val="NormalWeb"/>
+        <w:spacing w:before="0" w:beforeAutospacing="0" w:after="0" w:afterAutospacing="0"/>
+        <w:rPr>
+          <w:rFonts w:ascii="Calibri" w:hAnsi="Calibri" w:cs="Calibri"/>
+          <w:sz w:val="22"/>
+          <w:szCs w:val="22"/>
+        </w:rPr>
+      </w:pPr>
+      <w:r>
+        <w:rPr>
+          <w:rFonts w:ascii="Calibri" w:hAnsi="Calibri" w:cs="Calibri"/>
+          <w:sz w:val="22"/>
+          <w:szCs w:val="22"/>
+        </w:rPr>
+        <w:t xml:space="preserve">     completion while a generated verification script fails.</w:t>
+      </w:r>
+    </w:p>
+    <w:p>
+      <w:pPr>
+        <w:pStyle w:val="NormalWeb"/>
+        <w:spacing w:before="0" w:beforeAutospacing="0" w:after="0" w:afterAutospacing="0"/>
+        <w:rPr>
+          <w:rFonts w:ascii="Calibri" w:hAnsi="Calibri" w:cs="Calibri"/>
+          <w:sz w:val="22"/>
+          <w:szCs w:val="22"/>
+        </w:rPr>
+      </w:pPr>
+      <w:r>
+        <w:rPr>
+          <w:rFonts w:ascii="Calibri" w:hAnsi="Calibri" w:cs="Calibri"/>
+          <w:sz w:val="22"/>
+          <w:szCs w:val="22"/>
+        </w:rPr>
+        <w:t> </w:t>
+      </w:r>
+    </w:p>
+    <w:p>
+      <w:pPr>
+        <w:pStyle w:val="NormalWeb"/>
+        <w:spacing w:before="0" w:beforeAutospacing="0" w:after="0" w:afterAutospacing="0"/>
+        <w:rPr>
+          <w:rFonts w:ascii="Calibri" w:hAnsi="Calibri" w:cs="Calibri"/>
+          <w:sz w:val="22"/>
+          <w:szCs w:val="22"/>
+        </w:rPr>
+      </w:pPr>
+      <w:r>
+        <w:rPr>
+          <w:rFonts w:ascii="Calibri" w:hAnsi="Calibri" w:cs="Calibri"/>
+          <w:sz w:val="22"/>
+          <w:szCs w:val="22"/>
+        </w:rPr>
+        <w:t xml:space="preserve">  A successful connection or identity query proves communication only. It does</w:t>
+      </w:r>
+    </w:p>
+    <w:p>
+      <w:pPr>
+        <w:pStyle w:val="NormalWeb"/>
+        <w:spacing w:before="0" w:beforeAutospacing="0" w:after="0" w:afterAutospacing="0"/>
+        <w:rPr>
+          <w:rFonts w:ascii="Calibri" w:hAnsi="Calibri" w:cs="Calibri"/>
+          <w:sz w:val="22"/>
+          <w:szCs w:val="22"/>
+        </w:rPr>
+      </w:pPr>
+      <w:r>
+        <w:rPr>
+          <w:rFonts w:ascii="Calibri" w:hAnsi="Calibri" w:cs="Calibri"/>
+          <w:sz w:val="22"/>
+          <w:szCs w:val="22"/>
+        </w:rPr>
+        <w:t xml:space="preserve">  not prove the device’s primary data/control path.</w:t>
+      </w:r>
+    </w:p>
+    <w:p>
+      <w:pPr>
+        <w:pStyle w:val="NormalWeb"/>
+        <w:spacing w:before="0" w:beforeAutospacing="0" w:after="0" w:afterAutospacing="0"/>
+        <w:rPr>
+          <w:rFonts w:ascii="Calibri" w:hAnsi="Calibri" w:cs="Calibri"/>
+          <w:sz w:val="22"/>
+          <w:szCs w:val="22"/>
+        </w:rPr>
+      </w:pPr>
+      <w:r>
+        <w:rPr>
+          <w:rFonts w:ascii="Calibri" w:hAnsi="Calibri" w:cs="Calibri"/>
+          <w:sz w:val="22"/>
+          <w:szCs w:val="22"/>
+        </w:rPr>
+        <w:t> </w:t>
+      </w:r>
+    </w:p>
+    <w:p>
+      <w:pPr>
+        <w:pStyle w:val="NormalWeb"/>
+        <w:spacing w:before="0" w:beforeAutospacing="0" w:after="0" w:afterAutospacing="0"/>
+        <w:rPr>
+          <w:rFonts w:ascii="Calibri" w:hAnsi="Calibri" w:cs="Calibri"/>
+          <w:sz w:val="22"/>
+          <w:szCs w:val="22"/>
+        </w:rPr>
+      </w:pPr>
+      <w:r>
+        <w:rPr>
+          <w:rFonts w:ascii="Calibri" w:hAnsi="Calibri" w:cs="Calibri"/>
+          <w:sz w:val="22"/>
+          <w:szCs w:val="22"/>
+        </w:rPr>
+        <w:t xml:space="preserve">  ### Human-in-the-loop physical verification</w:t>
+      </w:r>
+    </w:p>
+    <w:p>
+      <w:pPr>
+        <w:pStyle w:val="NormalWeb"/>
+        <w:spacing w:before="0" w:beforeAutospacing="0" w:after="0" w:afterAutospacing="0"/>
+        <w:rPr>
+          <w:rFonts w:ascii="Calibri" w:hAnsi="Calibri" w:cs="Calibri"/>
+          <w:sz w:val="22"/>
+          <w:szCs w:val="22"/>
+        </w:rPr>
+      </w:pPr>
+      <w:r>
+        <w:rPr>
+          <w:rFonts w:ascii="Calibri" w:hAnsi="Calibri" w:cs="Calibri"/>
+          <w:sz w:val="22"/>
+          <w:szCs w:val="22"/>
+        </w:rPr>
+        <w:t> </w:t>
+      </w:r>
+    </w:p>
+    <w:p>
+      <w:pPr>
+        <w:pStyle w:val="NormalWeb"/>
+        <w:spacing w:before="0" w:beforeAutospacing="0" w:after="0" w:afterAutospacing="0"/>
+        <w:rPr>
+          <w:rFonts w:ascii="Calibri" w:hAnsi="Calibri" w:cs="Calibri"/>
+          <w:sz w:val="22"/>
+          <w:szCs w:val="22"/>
+        </w:rPr>
+      </w:pPr>
+      <w:r>
+        <w:rPr>
+          <w:rFonts w:ascii="Calibri" w:hAnsi="Calibri" w:cs="Calibri"/>
+          <w:sz w:val="22"/>
+          <w:szCs w:val="22"/>
+        </w:rPr>
+        <w:t xml:space="preserve">  For devices with visible physical behavior—motors, stages, relays, pumps,</w:t>
+      </w:r>
+    </w:p>
+    <w:p>
+      <w:pPr>
+        <w:pStyle w:val="NormalWeb"/>
+        <w:spacing w:before="0" w:beforeAutospacing="0" w:after="0" w:afterAutospacing="0"/>
+        <w:rPr>
+          <w:rFonts w:ascii="Calibri" w:hAnsi="Calibri" w:cs="Calibri"/>
+          <w:sz w:val="22"/>
+          <w:szCs w:val="22"/>
+        </w:rPr>
+      </w:pPr>
+      <w:r>
+        <w:rPr>
+          <w:rFonts w:ascii="Calibri" w:hAnsi="Calibri" w:cs="Calibri"/>
+          <w:sz w:val="22"/>
+          <w:szCs w:val="22"/>
+        </w:rPr>
+        <w:t xml:space="preserve">  valves, shutters, heaters, lasers, high-voltage equipment, or similar—the</w:t>
+      </w:r>
+    </w:p>
+    <w:p>
+      <w:pPr>
+        <w:pStyle w:val="NormalWeb"/>
+        <w:spacing w:before="0" w:beforeAutospacing="0" w:after="0" w:afterAutospacing="0"/>
+        <w:rPr>
+          <w:rFonts w:ascii="Calibri" w:hAnsi="Calibri" w:cs="Calibri"/>
+          <w:sz w:val="22"/>
+          <w:szCs w:val="22"/>
+        </w:rPr>
+      </w:pPr>
+      <w:r>
+        <w:rPr>
+          <w:rFonts w:ascii="Calibri" w:hAnsi="Calibri" w:cs="Calibri"/>
+          <w:sz w:val="22"/>
+          <w:szCs w:val="22"/>
+        </w:rPr>
+        <w:t xml:space="preserve">  agent must not autonomously perform physical motion/output tests unless they</w:t>
+      </w:r>
+    </w:p>
+    <w:p>
+      <w:pPr>
+        <w:pStyle w:val="NormalWeb"/>
+        <w:spacing w:before="0" w:beforeAutospacing="0" w:after="0" w:afterAutospacing="0"/>
+        <w:rPr>
+          <w:rFonts w:ascii="Calibri" w:hAnsi="Calibri" w:cs="Calibri"/>
+          <w:sz w:val="22"/>
+          <w:szCs w:val="22"/>
+        </w:rPr>
+      </w:pPr>
+      <w:r>
+        <w:rPr>
+          <w:rFonts w:ascii="Calibri" w:hAnsi="Calibri" w:cs="Calibri"/>
+          <w:sz w:val="22"/>
+          <w:szCs w:val="22"/>
+        </w:rPr>
+        <w:t xml:space="preserve">  are explicitly within the approved safety scope.</w:t>
+      </w:r>
+    </w:p>
+    <w:p>
+      <w:pPr>
+        <w:pStyle w:val="NormalWeb"/>
+        <w:spacing w:before="0" w:beforeAutospacing="0" w:after="0" w:afterAutospacing="0"/>
+        <w:rPr>
+          <w:rFonts w:ascii="Calibri" w:hAnsi="Calibri" w:cs="Calibri"/>
+          <w:sz w:val="22"/>
+          <w:szCs w:val="22"/>
+        </w:rPr>
+      </w:pPr>
+      <w:r>
+        <w:rPr>
+          <w:rFonts w:ascii="Calibri" w:hAnsi="Calibri" w:cs="Calibri"/>
+          <w:sz w:val="22"/>
+          <w:szCs w:val="22"/>
+        </w:rPr>
+        <w:t> </w:t>
+      </w:r>
+    </w:p>
+    <w:p>
+      <w:pPr>
+        <w:pStyle w:val="NormalWeb"/>
+        <w:spacing w:before="0" w:beforeAutospacing="0" w:after="0" w:afterAutospacing="0"/>
+        <w:rPr>
+          <w:rFonts w:ascii="Calibri" w:hAnsi="Calibri" w:cs="Calibri"/>
+          <w:sz w:val="22"/>
+          <w:szCs w:val="22"/>
+        </w:rPr>
+      </w:pPr>
+      <w:r>
+        <w:rPr>
+          <w:rFonts w:ascii="Calibri" w:hAnsi="Calibri" w:cs="Calibri"/>
+          <w:sz w:val="22"/>
+          <w:szCs w:val="22"/>
+        </w:rPr>
+        <w:t xml:space="preserve">  Instead:</w:t>
+      </w:r>
+    </w:p>
+    <w:p>
+      <w:pPr>
+        <w:pStyle w:val="NormalWeb"/>
+        <w:spacing w:before="0" w:beforeAutospacing="0" w:after="0" w:afterAutospacing="0"/>
+        <w:rPr>
+          <w:rFonts w:ascii="Calibri" w:hAnsi="Calibri" w:cs="Calibri"/>
+          <w:sz w:val="22"/>
+          <w:szCs w:val="22"/>
+        </w:rPr>
+      </w:pPr>
+      <w:r>
+        <w:rPr>
+          <w:rFonts w:ascii="Calibri" w:hAnsi="Calibri" w:cs="Calibri"/>
+          <w:sz w:val="22"/>
+          <w:szCs w:val="22"/>
+        </w:rPr>
+        <w:t> </w:t>
+      </w:r>
+    </w:p>
+    <w:p>
+      <w:pPr>
+        <w:pStyle w:val="NormalWeb"/>
+        <w:spacing w:before="0" w:beforeAutospacing="0" w:after="0" w:afterAutospacing="0"/>
+        <w:rPr>
+          <w:rFonts w:ascii="Calibri" w:hAnsi="Calibri" w:cs="Calibri"/>
+          <w:sz w:val="22"/>
+          <w:szCs w:val="22"/>
+        </w:rPr>
+      </w:pPr>
+      <w:r>
+        <w:rPr>
+          <w:rFonts w:ascii="Calibri" w:hAnsi="Calibri" w:cs="Calibri"/>
+          <w:sz w:val="22"/>
+          <w:szCs w:val="22"/>
+        </w:rPr>
+        <w:t xml:space="preserve">  1. Prepare a one-action verification script using a documented, bounded,</w:t>
+      </w:r>
+    </w:p>
+    <w:p>
+      <w:pPr>
+        <w:pStyle w:val="NormalWeb"/>
+        <w:spacing w:before="0" w:beforeAutospacing="0" w:after="0" w:afterAutospacing="0"/>
+        <w:rPr>
+          <w:rFonts w:ascii="Calibri" w:hAnsi="Calibri" w:cs="Calibri"/>
+          <w:sz w:val="22"/>
+          <w:szCs w:val="22"/>
+        </w:rPr>
+      </w:pPr>
+      <w:r>
+        <w:rPr>
+          <w:rFonts w:ascii="Calibri" w:hAnsi="Calibri" w:cs="Calibri"/>
+          <w:sz w:val="22"/>
+          <w:szCs w:val="22"/>
+        </w:rPr>
+        <w:t xml:space="preserve">     reversible operation.</w:t>
+      </w:r>
+    </w:p>
+    <w:p>
+      <w:pPr>
+        <w:pStyle w:val="NormalWeb"/>
+        <w:spacing w:before="0" w:beforeAutospacing="0" w:after="0" w:afterAutospacing="0"/>
+        <w:rPr>
+          <w:rFonts w:ascii="Calibri" w:hAnsi="Calibri" w:cs="Calibri"/>
+          <w:sz w:val="22"/>
+          <w:szCs w:val="22"/>
+        </w:rPr>
+      </w:pPr>
+      <w:r>
+        <w:rPr>
+          <w:rFonts w:ascii="Calibri" w:hAnsi="Calibri" w:cs="Calibri"/>
+          <w:sz w:val="22"/>
+          <w:szCs w:val="22"/>
+        </w:rPr>
+        <w:t xml:space="preserve">  2. Explain the expected visible behavior and restoration behavior.</w:t>
+      </w:r>
+    </w:p>
+    <w:p>
+      <w:pPr>
+        <w:pStyle w:val="NormalWeb"/>
+        <w:spacing w:before="0" w:beforeAutospacing="0" w:after="0" w:afterAutospacing="0"/>
+        <w:rPr>
+          <w:rFonts w:ascii="Calibri" w:hAnsi="Calibri" w:cs="Calibri"/>
+          <w:sz w:val="22"/>
+          <w:szCs w:val="22"/>
+        </w:rPr>
+      </w:pPr>
+      <w:r>
+        <w:rPr>
+          <w:rFonts w:ascii="Calibri" w:hAnsi="Calibri" w:cs="Calibri"/>
+          <w:sz w:val="22"/>
+          <w:szCs w:val="22"/>
+        </w:rPr>
+        <w:t xml:space="preserve">  3. Ask the user to observe the device and run/approve that one action.</w:t>
+      </w:r>
+    </w:p>
+    <w:p>
+      <w:pPr>
+        <w:pStyle w:val="NormalWeb"/>
+        <w:spacing w:before="0" w:beforeAutospacing="0" w:after="0" w:afterAutospacing="0"/>
+        <w:rPr>
+          <w:rFonts w:ascii="Calibri" w:hAnsi="Calibri" w:cs="Calibri"/>
+          <w:sz w:val="22"/>
+          <w:szCs w:val="22"/>
+        </w:rPr>
+      </w:pPr>
+      <w:r>
+        <w:rPr>
+          <w:rFonts w:ascii="Calibri" w:hAnsi="Calibri" w:cs="Calibri"/>
+          <w:sz w:val="22"/>
+          <w:szCs w:val="22"/>
+        </w:rPr>
+        <w:t xml:space="preserve">  4. Capture the user’s observation verbatim in the transcript.</w:t>
+      </w:r>
+    </w:p>
+    <w:p>
+      <w:pPr>
+        <w:pStyle w:val="NormalWeb"/>
+        <w:spacing w:before="0" w:beforeAutospacing="0" w:after="0" w:afterAutospacing="0"/>
+        <w:rPr>
+          <w:rFonts w:ascii="Calibri" w:hAnsi="Calibri" w:cs="Calibri"/>
+          <w:sz w:val="22"/>
+          <w:szCs w:val="22"/>
+        </w:rPr>
+      </w:pPr>
+      <w:r>
+        <w:rPr>
+          <w:rFonts w:ascii="Calibri" w:hAnsi="Calibri" w:cs="Calibri"/>
+          <w:sz w:val="22"/>
+          <w:szCs w:val="22"/>
+        </w:rPr>
+        <w:t xml:space="preserve">  5. Compare the observation with terminal/device feedback.</w:t>
+      </w:r>
+    </w:p>
+    <w:p>
+      <w:pPr>
+        <w:pStyle w:val="NormalWeb"/>
+        <w:spacing w:before="0" w:beforeAutospacing="0" w:after="0" w:afterAutospacing="0"/>
+        <w:rPr>
+          <w:rFonts w:ascii="Calibri" w:hAnsi="Calibri" w:cs="Calibri"/>
+          <w:sz w:val="22"/>
+          <w:szCs w:val="22"/>
+        </w:rPr>
+      </w:pPr>
+      <w:r>
+        <w:rPr>
+          <w:rFonts w:ascii="Calibri" w:hAnsi="Calibri" w:cs="Calibri"/>
+          <w:sz w:val="22"/>
+          <w:szCs w:val="22"/>
+        </w:rPr>
+        <w:t xml:space="preserve">  6. Restore the prior state and verify restoration.</w:t>
+      </w:r>
+    </w:p>
+    <w:p>
+      <w:pPr>
+        <w:pStyle w:val="NormalWeb"/>
+        <w:spacing w:before="0" w:beforeAutospacing="0" w:after="0" w:afterAutospacing="0"/>
+        <w:rPr>
+          <w:rFonts w:ascii="Calibri" w:hAnsi="Calibri" w:cs="Calibri"/>
+          <w:sz w:val="22"/>
+          <w:szCs w:val="22"/>
+        </w:rPr>
+      </w:pPr>
+      <w:r>
+        <w:rPr>
+          <w:rFonts w:ascii="Calibri" w:hAnsi="Calibri" w:cs="Calibri"/>
+          <w:sz w:val="22"/>
+          <w:szCs w:val="22"/>
+        </w:rPr>
+        <w:t> </w:t>
+      </w:r>
+    </w:p>
+    <w:p>
+      <w:pPr>
+        <w:pStyle w:val="NormalWeb"/>
+        <w:spacing w:before="0" w:beforeAutospacing="0" w:after="0" w:afterAutospacing="0"/>
+        <w:rPr>
+          <w:rFonts w:ascii="Calibri" w:hAnsi="Calibri" w:cs="Calibri"/>
+          <w:sz w:val="22"/>
+          <w:szCs w:val="22"/>
+        </w:rPr>
+      </w:pPr>
+      <w:r>
+        <w:rPr>
+          <w:rFonts w:ascii="Calibri" w:hAnsi="Calibri" w:cs="Calibri"/>
+          <w:sz w:val="22"/>
+          <w:szCs w:val="22"/>
+        </w:rPr>
+        <w:t xml:space="preserve">  Give only one or two physical actions at a time. Never treat a command-success</w:t>
+      </w:r>
+    </w:p>
+    <w:p>
+      <w:pPr>
+        <w:pStyle w:val="NormalWeb"/>
+        <w:spacing w:before="0" w:beforeAutospacing="0" w:after="0" w:afterAutospacing="0"/>
+        <w:rPr>
+          <w:rFonts w:ascii="Calibri" w:hAnsi="Calibri" w:cs="Calibri"/>
+          <w:sz w:val="22"/>
+          <w:szCs w:val="22"/>
+        </w:rPr>
+      </w:pPr>
+      <w:r>
+        <w:rPr>
+          <w:rFonts w:ascii="Calibri" w:hAnsi="Calibri" w:cs="Calibri"/>
+          <w:sz w:val="22"/>
+          <w:szCs w:val="22"/>
+        </w:rPr>
+        <w:t xml:space="preserve">  response as proof that motion, output, or acquisition actually occurred.</w:t>
+      </w:r>
+    </w:p>
+    <w:p>
+      <w:pPr>
+        <w:pStyle w:val="NormalWeb"/>
+        <w:spacing w:before="0" w:beforeAutospacing="0" w:after="0" w:afterAutospacing="0"/>
+        <w:rPr>
+          <w:rFonts w:ascii="Calibri" w:hAnsi="Calibri" w:cs="Calibri"/>
+          <w:sz w:val="22"/>
+          <w:szCs w:val="22"/>
+        </w:rPr>
+      </w:pPr>
+      <w:r>
+        <w:rPr>
+          <w:rFonts w:ascii="Calibri" w:hAnsi="Calibri" w:cs="Calibri"/>
+          <w:sz w:val="22"/>
+          <w:szCs w:val="22"/>
+        </w:rPr>
+        <w:t> </w:t>
+      </w:r>
+    </w:p>
+    <w:p>
+      <w:pPr>
+        <w:pStyle w:val="NormalWeb"/>
+        <w:spacing w:before="0" w:beforeAutospacing="0" w:after="0" w:afterAutospacing="0"/>
+        <w:rPr>
+          <w:rFonts w:ascii="Calibri" w:hAnsi="Calibri" w:cs="Calibri"/>
+          <w:sz w:val="22"/>
+          <w:szCs w:val="22"/>
+        </w:rPr>
+      </w:pPr>
+      <w:r>
+        <w:rPr>
+          <w:rFonts w:ascii="Calibri" w:hAnsi="Calibri" w:cs="Calibri"/>
+          <w:sz w:val="22"/>
+          <w:szCs w:val="22"/>
+        </w:rPr>
+        <w:t xml:space="preserve">  ### Completion gate</w:t>
+      </w:r>
+    </w:p>
+    <w:p>
+      <w:pPr>
+        <w:pStyle w:val="NormalWeb"/>
+        <w:spacing w:before="0" w:beforeAutospacing="0" w:after="0" w:afterAutospacing="0"/>
+        <w:rPr>
+          <w:rFonts w:ascii="Calibri" w:hAnsi="Calibri" w:cs="Calibri"/>
+          <w:sz w:val="22"/>
+          <w:szCs w:val="22"/>
+        </w:rPr>
+      </w:pPr>
+      <w:r>
+        <w:rPr>
+          <w:rFonts w:ascii="Calibri" w:hAnsi="Calibri" w:cs="Calibri"/>
+          <w:sz w:val="22"/>
+          <w:szCs w:val="22"/>
+        </w:rPr>
+        <w:t> </w:t>
+      </w:r>
+    </w:p>
+    <w:p>
+      <w:pPr>
+        <w:pStyle w:val="NormalWeb"/>
+        <w:spacing w:before="0" w:beforeAutospacing="0" w:after="0" w:afterAutospacing="0"/>
+        <w:rPr>
+          <w:rFonts w:ascii="Calibri" w:hAnsi="Calibri" w:cs="Calibri"/>
+          <w:sz w:val="22"/>
+          <w:szCs w:val="22"/>
+        </w:rPr>
+      </w:pPr>
+      <w:r>
+        <w:rPr>
+          <w:rFonts w:ascii="Calibri" w:hAnsi="Calibri" w:cs="Calibri"/>
+          <w:sz w:val="22"/>
+          <w:szCs w:val="22"/>
+        </w:rPr>
+        <w:t xml:space="preserve">  Do not mark the software-development stage complete until:</w:t>
+      </w:r>
+    </w:p>
+    <w:p>
+      <w:pPr>
+        <w:pStyle w:val="NormalWeb"/>
+        <w:spacing w:before="0" w:beforeAutospacing="0" w:after="0" w:afterAutospacing="0"/>
+        <w:rPr>
+          <w:rFonts w:ascii="Calibri" w:hAnsi="Calibri" w:cs="Calibri"/>
+          <w:sz w:val="22"/>
+          <w:szCs w:val="22"/>
+        </w:rPr>
+      </w:pPr>
+      <w:r>
+        <w:rPr>
+          <w:rFonts w:ascii="Calibri" w:hAnsi="Calibri" w:cs="Calibri"/>
+          <w:sz w:val="22"/>
+          <w:szCs w:val="22"/>
+        </w:rPr>
+        <w:t> </w:t>
+      </w:r>
+    </w:p>
+    <w:p>
+      <w:pPr>
+        <w:pStyle w:val="NormalWeb"/>
+        <w:spacing w:before="0" w:beforeAutospacing="0" w:after="0" w:afterAutospacing="0"/>
+        <w:rPr>
+          <w:rFonts w:ascii="Calibri" w:hAnsi="Calibri" w:cs="Calibri"/>
+          <w:sz w:val="22"/>
+          <w:szCs w:val="22"/>
+        </w:rPr>
+      </w:pPr>
+      <w:r>
+        <w:rPr>
+          <w:rFonts w:ascii="Calibri" w:hAnsi="Calibri" w:cs="Calibri"/>
+          <w:sz w:val="22"/>
+          <w:szCs w:val="22"/>
+        </w:rPr>
+        <w:t xml:space="preserve">  - unit tests pass;</w:t>
+      </w:r>
+    </w:p>
+    <w:p>
+      <w:pPr>
+        <w:pStyle w:val="NormalWeb"/>
+        <w:spacing w:before="0" w:beforeAutospacing="0" w:after="0" w:afterAutospacing="0"/>
+        <w:rPr>
+          <w:rFonts w:ascii="Calibri" w:hAnsi="Calibri" w:cs="Calibri"/>
+          <w:sz w:val="22"/>
+          <w:szCs w:val="22"/>
+        </w:rPr>
+      </w:pPr>
+      <w:r>
+        <w:rPr>
+          <w:rFonts w:ascii="Calibri" w:hAnsi="Calibri" w:cs="Calibri"/>
+          <w:sz w:val="22"/>
+          <w:szCs w:val="22"/>
+        </w:rPr>
+        <w:t xml:space="preserve">  - package installation/import succeeds in the intended environment;</w:t>
+      </w:r>
+    </w:p>
+    <w:p>
+      <w:pPr>
+        <w:pStyle w:val="NormalWeb"/>
+        <w:spacing w:before="0" w:beforeAutospacing="0" w:after="0" w:afterAutospacing="0"/>
+        <w:rPr>
+          <w:rFonts w:ascii="Calibri" w:hAnsi="Calibri" w:cs="Calibri"/>
+          <w:sz w:val="22"/>
+          <w:szCs w:val="22"/>
+        </w:rPr>
+      </w:pPr>
+      <w:r>
+        <w:rPr>
+          <w:rFonts w:ascii="Calibri" w:hAnsi="Calibri" w:cs="Calibri"/>
+          <w:sz w:val="22"/>
+          <w:szCs w:val="22"/>
+        </w:rPr>
+        <w:t xml:space="preserve">  - all created verification scripts pass their safe applicable checks;</w:t>
+      </w:r>
+    </w:p>
+    <w:p>
+      <w:pPr>
+        <w:pStyle w:val="NormalWeb"/>
+        <w:spacing w:before="0" w:beforeAutospacing="0" w:after="0" w:afterAutospacing="0"/>
+        <w:rPr>
+          <w:rFonts w:ascii="Calibri" w:hAnsi="Calibri" w:cs="Calibri"/>
+          <w:sz w:val="22"/>
+          <w:szCs w:val="22"/>
+        </w:rPr>
+      </w:pPr>
+      <w:r>
+        <w:rPr>
+          <w:rFonts w:ascii="Calibri" w:hAnsi="Calibri" w:cs="Calibri"/>
+          <w:sz w:val="22"/>
+          <w:szCs w:val="22"/>
+        </w:rPr>
+        <w:t xml:space="preserve">  - a human-readable output artifact is saved and inspected;</w:t>
+      </w:r>
+    </w:p>
+    <w:p>
+      <w:pPr>
+        <w:pStyle w:val="NormalWeb"/>
+        <w:spacing w:before="0" w:beforeAutospacing="0" w:after="0" w:afterAutospacing="0"/>
+        <w:rPr>
+          <w:rFonts w:ascii="Calibri" w:hAnsi="Calibri" w:cs="Calibri"/>
+          <w:sz w:val="22"/>
+          <w:szCs w:val="22"/>
+        </w:rPr>
+      </w:pPr>
+      <w:r>
+        <w:rPr>
+          <w:rFonts w:ascii="Calibri" w:hAnsi="Calibri" w:cs="Calibri"/>
+          <w:sz w:val="22"/>
+          <w:szCs w:val="22"/>
+        </w:rPr>
+        <w:t xml:space="preserve">  - settings output is saved and inspectable;</w:t>
+      </w:r>
+    </w:p>
+    <w:p>
+      <w:pPr>
+        <w:pStyle w:val="NormalWeb"/>
+        <w:spacing w:before="0" w:beforeAutospacing="0" w:after="0" w:afterAutospacing="0"/>
+        <w:rPr>
+          <w:rFonts w:ascii="Calibri" w:hAnsi="Calibri" w:cs="Calibri"/>
+          <w:sz w:val="22"/>
+          <w:szCs w:val="22"/>
+        </w:rPr>
+      </w:pPr>
+      <w:r>
+        <w:rPr>
+          <w:rFonts w:ascii="Calibri" w:hAnsi="Calibri" w:cs="Calibri"/>
+          <w:sz w:val="22"/>
+          <w:szCs w:val="22"/>
+        </w:rPr>
+        <w:t xml:space="preserve">  - temporary state has been restored and verified;</w:t>
+      </w:r>
+    </w:p>
+    <w:p>
+      <w:pPr>
+        <w:pStyle w:val="NormalWeb"/>
+        <w:spacing w:before="0" w:beforeAutospacing="0" w:after="0" w:afterAutospacing="0"/>
+        <w:rPr>
+          <w:rFonts w:ascii="Calibri" w:hAnsi="Calibri" w:cs="Calibri"/>
+          <w:sz w:val="22"/>
+          <w:szCs w:val="22"/>
+        </w:rPr>
+      </w:pPr>
+      <w:r>
+        <w:rPr>
+          <w:rFonts w:ascii="Calibri" w:hAnsi="Calibri" w:cs="Calibri"/>
+          <w:sz w:val="22"/>
+          <w:szCs w:val="22"/>
+        </w:rPr>
+        <w:t xml:space="preserve">  - real-device, mock-only, and human-observed evidence are clearly labeled;</w:t>
+      </w:r>
+    </w:p>
+    <w:p>
+      <w:pPr>
+        <w:pStyle w:val="NormalWeb"/>
+        <w:spacing w:before="0" w:beforeAutospacing="0" w:after="0" w:afterAutospacing="0"/>
+        <w:rPr>
+          <w:rFonts w:ascii="Calibri" w:hAnsi="Calibri" w:cs="Calibri"/>
+          <w:sz w:val="22"/>
+          <w:szCs w:val="22"/>
+        </w:rPr>
+      </w:pPr>
+      <w:r>
+        <w:rPr>
+          <w:rFonts w:ascii="Calibri" w:hAnsi="Calibri" w:cs="Calibri"/>
+          <w:sz w:val="22"/>
+          <w:szCs w:val="22"/>
+        </w:rPr>
+        <w:t xml:space="preserve">  - unresolved calibration, conversion, timing, safety, or performance gaps are</w:t>
+      </w:r>
+    </w:p>
+    <w:p>
+      <w:pPr>
+        <w:pStyle w:val="NormalWeb"/>
+        <w:spacing w:before="0" w:beforeAutospacing="0" w:after="0" w:afterAutospacing="0"/>
+        <w:rPr>
+          <w:rFonts w:ascii="Calibri" w:hAnsi="Calibri" w:cs="Calibri"/>
+          <w:sz w:val="22"/>
+          <w:szCs w:val="22"/>
+        </w:rPr>
+      </w:pPr>
+      <w:r>
+        <w:rPr>
+          <w:rFonts w:ascii="Calibri" w:hAnsi="Calibri" w:cs="Calibri"/>
+          <w:sz w:val="22"/>
+          <w:szCs w:val="22"/>
+        </w:rPr>
+        <w:t xml:space="preserve">    documented rather than hidden.</w:t>
+      </w:r>
+    </w:p>
+    <w:p>
+      <w:pPr>
+        <w:pStyle w:val="NormalWeb"/>
+        <w:spacing w:before="0" w:beforeAutospacing="0" w:after="0" w:afterAutospacing="0"/>
+        <w:rPr>
+          <w:rFonts w:ascii="Calibri" w:hAnsi="Calibri" w:cs="Calibri"/>
+          <w:sz w:val="22"/>
+          <w:szCs w:val="22"/>
+        </w:rPr>
+      </w:pPr>
+      <w:r>
+        <w:rPr>
+          <w:rFonts w:ascii="Calibri" w:hAnsi="Calibri" w:cs="Calibri"/>
+          <w:sz w:val="22"/>
+          <w:szCs w:val="22"/>
+        </w:rPr>
+        <w:t> </w:t>
+      </w:r>
+    </w:p>
+    <w:p>
+      <w:pPr>
+        <w:pStyle w:val="NormalWeb"/>
+        <w:spacing w:before="0" w:beforeAutospacing="0" w:after="0" w:afterAutospacing="0"/>
+        <w:rPr>
+          <w:rFonts w:ascii="Calibri" w:hAnsi="Calibri" w:cs="Calibri"/>
+          <w:sz w:val="22"/>
+          <w:szCs w:val="22"/>
+        </w:rPr>
+      </w:pPr>
+      <w:r>
+        <w:rPr>
+          <w:rFonts w:ascii="Calibri" w:hAnsi="Calibri" w:cs="Calibri"/>
+          <w:sz w:val="22"/>
+          <w:szCs w:val="22"/>
+        </w:rPr>
+        <w:lastRenderedPageBreak/>
+        <w:t xml:space="preserve">  The important design shift is: verification output is a first-class</w:t>
+      </w:r>
+    </w:p>
+    <w:p>
+      <w:pPr>
+        <w:pStyle w:val="NormalWeb"/>
+        <w:spacing w:before="0" w:beforeAutospacing="0" w:after="0" w:afterAutospacing="0"/>
+        <w:rPr>
+          <w:rFonts w:ascii="Calibri" w:hAnsi="Calibri" w:cs="Calibri"/>
+          <w:sz w:val="22"/>
+          <w:szCs w:val="22"/>
+        </w:rPr>
+      </w:pPr>
+      <w:r>
+        <w:rPr>
+          <w:rFonts w:ascii="Calibri" w:hAnsi="Calibri" w:cs="Calibri"/>
+          <w:sz w:val="22"/>
+          <w:szCs w:val="22"/>
+        </w:rPr>
+        <w:t xml:space="preserve">  deliverable, not terminal noise. Each run leaves behind a plot/image/table/log</w:t>
+      </w:r>
+    </w:p>
+    <w:p>
+      <w:pPr>
+        <w:pStyle w:val="NormalWeb"/>
+        <w:spacing w:before="0" w:beforeAutospacing="0" w:after="0" w:afterAutospacing="0"/>
+        <w:rPr>
+          <w:rFonts w:ascii="Calibri" w:hAnsi="Calibri" w:cs="Calibri"/>
+          <w:sz w:val="22"/>
+          <w:szCs w:val="22"/>
+        </w:rPr>
+      </w:pPr>
+      <w:r>
+        <w:rPr>
+          <w:rFonts w:ascii="Calibri" w:hAnsi="Calibri" w:cs="Calibri"/>
+          <w:sz w:val="22"/>
+          <w:szCs w:val="22"/>
+        </w:rPr>
+        <w:t xml:space="preserve">  that both the user and the next agent can inspect.</w:t>
       </w:r>
     </w:p>
     <w:p/>

</xml_diff>